<commit_message>
Update model tuning workflows and final report
</commit_message>
<xml_diff>
--- a/docs/bao_cao_project_hose_stock_prediction.docx
+++ b/docs/bao_cao_project_hose_stock_prediction.docx
@@ -41,7 +41,7 @@
         <w:drawing>
           <wp:inline xmlns:a="http://schemas.openxmlformats.org/drawingml/2006/main" xmlns:pic="http://schemas.openxmlformats.org/drawingml/2006/picture">
             <wp:extent cx="1234440" cy="1234440"/>
-            <wp:docPr id="1" name="Picture 1"/>
+            <wp:docPr id="1" name="Picture 1" descr="Logo báo cáo" title="Logo báo cáo"/>
             <wp:cNvGraphicFramePr>
               <a:graphicFrameLocks noChangeAspect="1"/>
             </wp:cNvGraphicFramePr>
@@ -118,6 +118,10 @@
         <w:gridCol w:w="4535"/>
       </w:tblGrid>
       <w:tr>
+        <w:trPr>
+          <w:tblHeader/>
+          <w:cantSplit/>
+        </w:trPr>
         <w:tc>
           <w:tcPr>
             <w:tcW w:type="dxa" w:w="4535"/>
@@ -166,6 +170,9 @@
         </w:tc>
       </w:tr>
       <w:tr>
+        <w:trPr>
+          <w:cantSplit/>
+        </w:trPr>
         <w:tc>
           <w:tcPr>
             <w:tcW w:type="dxa" w:w="4535"/>
@@ -214,6 +221,9 @@
         </w:tc>
       </w:tr>
       <w:tr>
+        <w:trPr>
+          <w:cantSplit/>
+        </w:trPr>
         <w:tc>
           <w:tcPr>
             <w:tcW w:type="dxa" w:w="4535"/>
@@ -262,6 +272,9 @@
         </w:tc>
       </w:tr>
       <w:tr>
+        <w:trPr>
+          <w:cantSplit/>
+        </w:trPr>
         <w:tc>
           <w:tcPr>
             <w:tcW w:type="dxa" w:w="4535"/>
@@ -346,7 +359,7 @@
         <w:rPr>
           <w:rFonts w:ascii="Times New Roman" w:hAnsi="Times New Roman" w:eastAsia="Times New Roman" w:cs="Times New Roman"/>
         </w:rPr>
-        <w:t>Dự án xây dựng hệ thống hỗ trợ dự báo xu hướng cổ phiếu niêm yết trên sàn HOSE bằng kỹ thuật học máy. Bài toán được định nghĩa dưới dạng phân loại nhị phân: với một mã cổ phiếu tại ngày tham chiếu, hệ thống dự báo giá đóng cửa sau 5 phiên giao dịch có tăng hơn 1% hay không. Dữ liệu đầu vào là chuỗi OHLCV theo ngày, được làm sạch, kiểm tra chất lượng, tạo 15 đặc trưng kỹ thuật như lợi suất, trung bình trượt, RSI, độ biến động và tỷ lệ khối lượng. Pipeline huấn luyện sử dụng chia train/test theo thời gian dựa trên label_end_date, TimeSeriesSplit có khoảng cách gap 5 và RandomizedSearchCV để tinh chỉnh Logistic Regression, Random Forest và Gradient Boosting, kèm Dummy Classifier làm baseline. Kết quả hiện tại chọn Random Forest làm mô hình cuối với F1_UP = 0.4391, Recall_UP = 0.5142 trên tập kiểm thử 41,232 dòng. Sản phẩm bàn giao gồm pipeline xử lý dữ liệu, mô hình final_model.pkl, báo cáo đánh giá, SQLite đồng bộ dữ liệu/report và giao diện Flask/CLI để dự báo. Dự án có ý nghĩa học thuật trong việc minh họa quy trình xây dựng hệ thống machine learning chuỗi thời gian, nhưng không phải khuyến nghị đầu tư.</w:t>
+        <w:t>Dự án xây dựng hệ thống hỗ trợ dự báo xu hướng cổ phiếu niêm yết trên sàn HOSE bằng kỹ thuật học máy. Bài toán được định nghĩa dưới dạng phân loại nhị phân: với một mã cổ phiếu tại ngày tham chiếu, hệ thống dự báo giá đóng cửa sau 5 phiên giao dịch có tăng hơn 1% hay không. Dữ liệu đầu vào là chuỗi OHLCV theo ngày, được làm sạch, kiểm tra chất lượng và tạo 20 đặc trưng kỹ thuật. Tuning Lab đánh giá từng cấu hình Logistic Regression, Random Forest và Gradient Boosting bằng TimeSeriesSplit trên TRAIN; ba cấu hình được chốt theo fingerprint dữ liệu và pipeline chính thức chạy lại CV, fit trên toàn TRAIN, đồng thời chốt decision threshold. Dummy Classifier chỉ là baseline. Trên tập TEST held-out 95,022 dòng, Gradient Boosting được chọn làm mô hình cuối với F1_UP = 0.5053 và Recall_UP = 0.9176. Sản phẩm bàn giao gồm pipeline dữ liệu, final_model.pkl, model_metadata.json, báo cáo đánh giá, SQLite và giao diện Flask/CLI. Kết quả chỉ phục vụ mục tiêu học thuật, không phải khuyến nghị đầu tư.</w:t>
       </w:r>
     </w:p>
     <w:p>
@@ -542,7 +555,7 @@
           <w:rFonts w:ascii="Times New Roman" w:hAnsi="Times New Roman" w:eastAsia="Times New Roman" w:cs="Times New Roman"/>
           <w:sz w:val="26"/>
         </w:rPr>
-        <w:t>Hình 3. Ma trận nhầm lẫn trực quan</w:t>
+        <w:t>Hình 3. Quy trình tuning Logistic Regression</w:t>
       </w:r>
     </w:p>
     <w:p>
@@ -554,7 +567,55 @@
           <w:rFonts w:ascii="Times New Roman" w:hAnsi="Times New Roman" w:eastAsia="Times New Roman" w:cs="Times New Roman"/>
           <w:sz w:val="26"/>
         </w:rPr>
-        <w:t>Hình 4. Biểu đồ top đặc trưng quan trọng</w:t>
+        <w:t>Hình 4. Quy trình tuning Random Forest</w:t>
+      </w:r>
+    </w:p>
+    <w:p>
+      <w:pPr>
+        <w:pStyle w:val="ListBullet"/>
+      </w:pPr>
+      <w:r>
+        <w:rPr>
+          <w:rFonts w:ascii="Times New Roman" w:hAnsi="Times New Roman" w:eastAsia="Times New Roman" w:cs="Times New Roman"/>
+          <w:sz w:val="26"/>
+        </w:rPr>
+        <w:t>Hình 5. Quy trình tuning Gradient Boosting</w:t>
+      </w:r>
+    </w:p>
+    <w:p>
+      <w:pPr>
+        <w:pStyle w:val="ListBullet"/>
+      </w:pPr>
+      <w:r>
+        <w:rPr>
+          <w:rFonts w:ascii="Times New Roman" w:hAnsi="Times New Roman" w:eastAsia="Times New Roman" w:cs="Times New Roman"/>
+          <w:sz w:val="26"/>
+        </w:rPr>
+        <w:t>Hình 6. Đánh giá ba mô hình trên TEST và lựa chọn Final Model</w:t>
+      </w:r>
+    </w:p>
+    <w:p>
+      <w:pPr>
+        <w:pStyle w:val="ListBullet"/>
+      </w:pPr>
+      <w:r>
+        <w:rPr>
+          <w:rFonts w:ascii="Times New Roman" w:hAnsi="Times New Roman" w:eastAsia="Times New Roman" w:cs="Times New Roman"/>
+          <w:sz w:val="26"/>
+        </w:rPr>
+        <w:t>Hình 7. Ma trận nhầm lẫn của mô hình cuối</w:t>
+      </w:r>
+    </w:p>
+    <w:p>
+      <w:pPr>
+        <w:pStyle w:val="ListBullet"/>
+      </w:pPr>
+      <w:r>
+        <w:rPr>
+          <w:rFonts w:ascii="Times New Roman" w:hAnsi="Times New Roman" w:eastAsia="Times New Roman" w:cs="Times New Roman"/>
+          <w:sz w:val="26"/>
+        </w:rPr>
+        <w:t>Hình 8. Top đặc trưng quan trọng của Gradient Boosting</w:t>
       </w:r>
     </w:p>
     <w:p>
@@ -597,6 +658,10 @@
         <w:gridCol w:w="4535"/>
       </w:tblGrid>
       <w:tr>
+        <w:trPr>
+          <w:tblHeader/>
+          <w:cantSplit/>
+        </w:trPr>
         <w:tc>
           <w:tcPr>
             <w:tcW w:type="dxa" w:w="1944"/>
@@ -653,6 +718,9 @@
         </w:tc>
       </w:tr>
       <w:tr>
+        <w:trPr>
+          <w:cantSplit/>
+        </w:trPr>
         <w:tc>
           <w:tcPr>
             <w:tcW w:type="dxa" w:w="4535"/>
@@ -707,6 +775,9 @@
         </w:tc>
       </w:tr>
       <w:tr>
+        <w:trPr>
+          <w:cantSplit/>
+        </w:trPr>
         <w:tc>
           <w:tcPr>
             <w:tcW w:type="dxa" w:w="4535"/>
@@ -761,6 +832,9 @@
         </w:tc>
       </w:tr>
       <w:tr>
+        <w:trPr>
+          <w:cantSplit/>
+        </w:trPr>
         <w:tc>
           <w:tcPr>
             <w:tcW w:type="dxa" w:w="4535"/>
@@ -815,6 +889,9 @@
         </w:tc>
       </w:tr>
       <w:tr>
+        <w:trPr>
+          <w:cantSplit/>
+        </w:trPr>
         <w:tc>
           <w:tcPr>
             <w:tcW w:type="dxa" w:w="4535"/>
@@ -869,6 +946,9 @@
         </w:tc>
       </w:tr>
       <w:tr>
+        <w:trPr>
+          <w:cantSplit/>
+        </w:trPr>
         <w:tc>
           <w:tcPr>
             <w:tcW w:type="dxa" w:w="4535"/>
@@ -923,6 +1003,9 @@
         </w:tc>
       </w:tr>
       <w:tr>
+        <w:trPr>
+          <w:cantSplit/>
+        </w:trPr>
         <w:tc>
           <w:tcPr>
             <w:tcW w:type="dxa" w:w="4535"/>
@@ -977,6 +1060,9 @@
         </w:tc>
       </w:tr>
       <w:tr>
+        <w:trPr>
+          <w:cantSplit/>
+        </w:trPr>
         <w:tc>
           <w:tcPr>
             <w:tcW w:type="dxa" w:w="4535"/>
@@ -1031,6 +1117,9 @@
         </w:tc>
       </w:tr>
       <w:tr>
+        <w:trPr>
+          <w:cantSplit/>
+        </w:trPr>
         <w:tc>
           <w:tcPr>
             <w:tcW w:type="dxa" w:w="4535"/>
@@ -1085,6 +1174,9 @@
         </w:tc>
       </w:tr>
       <w:tr>
+        <w:trPr>
+          <w:cantSplit/>
+        </w:trPr>
         <w:tc>
           <w:tcPr>
             <w:tcW w:type="dxa" w:w="4535"/>
@@ -1139,6 +1231,9 @@
         </w:tc>
       </w:tr>
       <w:tr>
+        <w:trPr>
+          <w:cantSplit/>
+        </w:trPr>
         <w:tc>
           <w:tcPr>
             <w:tcW w:type="dxa" w:w="4535"/>
@@ -1193,6 +1288,9 @@
         </w:tc>
       </w:tr>
       <w:tr>
+        <w:trPr>
+          <w:cantSplit/>
+        </w:trPr>
         <w:tc>
           <w:tcPr>
             <w:tcW w:type="dxa" w:w="4535"/>
@@ -1247,6 +1345,9 @@
         </w:tc>
       </w:tr>
       <w:tr>
+        <w:trPr>
+          <w:cantSplit/>
+        </w:trPr>
         <w:tc>
           <w:tcPr>
             <w:tcW w:type="dxa" w:w="4535"/>
@@ -1485,7 +1586,7 @@
         <w:rPr>
           <w:rFonts w:ascii="Times New Roman" w:hAnsi="Times New Roman" w:eastAsia="Times New Roman" w:cs="Times New Roman"/>
         </w:rPr>
-        <w:t>Feature engineering chuyển dữ liệu OHLCV thành các biến số mà mô hình có thể học được. Nhóm đặc trưng chính gồm return_1d, return_3d, return_5d, close_open_return, SMA5/SMA20/SMA50, quan hệ giữa giá đóng cửa và SMA, RSI14, volatility_5d, volatility_20d, price_range, volume_change_1d và volume_ratio_20. Các feature này được tính riêng theo từng mã cổ phiếu để không trộn lịch sử của các mã khác nhau.</w:t>
+        <w:t>Feature engineering chuyển dữ liệu OHLCV thành 20 biến đầu vào: return_1d, return_3d, return_5d, close_open_return, sma5, sma20, sma50, close_vs_sma20, sma20_vs_sma50, rsi14, volatility_5d, volatility_20d, price_range, volume_change_1d, volume_ratio_20, return_10d, return_20d, dist_high20, dist_low20 và month. Các feature được tính riêng theo từng mã để không trộn lịch sử giữa các cổ phiếu.</w:t>
       </w:r>
     </w:p>
     <w:p>
@@ -1494,7 +1595,7 @@
         <w:rPr>
           <w:rFonts w:ascii="Times New Roman" w:hAnsi="Times New Roman" w:eastAsia="Times New Roman" w:cs="Times New Roman"/>
         </w:rPr>
-        <w:t>Data leakage được kiểm soát bằng cách không đưa future_close_5d, future_return_5d, target và label_end_date vào danh sách FEATURE_COLUMNS. Dữ liệu được chia train/test theo label_end_date thay vì random split. Trong cross validation, TimeSeriesSplit sử dụng gap = 5 để giảm nguy cơ rò rỉ do nhãn có cửa sổ 5 phiên.</w:t>
+        <w:t>Data leakage được kiểm soát bằng cách không đưa future_close_5d, future_return_5d, target và label_end_date vào FEATURE_COLUMNS; TRAIN/TEST được chia theo label_end_date thay vì random split. TimeSeriesSplit dùng gap = 5, nhưng đây là năm dòng trên bảng TRAIN gộp nhiều mã, không phải năm phiên giao dịch của từng mã.</w:t>
       </w:r>
     </w:p>
     <w:p>
@@ -1533,6 +1634,10 @@
         <w:gridCol w:w="3024"/>
       </w:tblGrid>
       <w:tr>
+        <w:trPr>
+          <w:tblHeader/>
+          <w:cantSplit/>
+        </w:trPr>
         <w:tc>
           <w:tcPr>
             <w:tcW w:type="dxa" w:w="1944"/>
@@ -1616,6 +1721,9 @@
         </w:tc>
       </w:tr>
       <w:tr>
+        <w:trPr>
+          <w:cantSplit/>
+        </w:trPr>
         <w:tc>
           <w:tcPr>
             <w:tcW w:type="dxa" w:w="3024"/>
@@ -1696,6 +1804,9 @@
         </w:tc>
       </w:tr>
       <w:tr>
+        <w:trPr>
+          <w:cantSplit/>
+        </w:trPr>
         <w:tc>
           <w:tcPr>
             <w:tcW w:type="dxa" w:w="3024"/>
@@ -1776,6 +1887,9 @@
         </w:tc>
       </w:tr>
       <w:tr>
+        <w:trPr>
+          <w:cantSplit/>
+        </w:trPr>
         <w:tc>
           <w:tcPr>
             <w:tcW w:type="dxa" w:w="3024"/>
@@ -1856,6 +1970,9 @@
         </w:tc>
       </w:tr>
       <w:tr>
+        <w:trPr>
+          <w:cantSplit/>
+        </w:trPr>
         <w:tc>
           <w:tcPr>
             <w:tcW w:type="dxa" w:w="3024"/>
@@ -1936,6 +2053,9 @@
         </w:tc>
       </w:tr>
       <w:tr>
+        <w:trPr>
+          <w:cantSplit/>
+        </w:trPr>
         <w:tc>
           <w:tcPr>
             <w:tcW w:type="dxa" w:w="3024"/>
@@ -2016,6 +2136,9 @@
         </w:tc>
       </w:tr>
       <w:tr>
+        <w:trPr>
+          <w:cantSplit/>
+        </w:trPr>
         <w:tc>
           <w:tcPr>
             <w:tcW w:type="dxa" w:w="3024"/>
@@ -2096,6 +2219,9 @@
         </w:tc>
       </w:tr>
       <w:tr>
+        <w:trPr>
+          <w:cantSplit/>
+        </w:trPr>
         <w:tc>
           <w:tcPr>
             <w:tcW w:type="dxa" w:w="3024"/>
@@ -2223,7 +2349,7 @@
         <w:rPr>
           <w:rFonts w:ascii="Times New Roman" w:hAnsi="Times New Roman" w:eastAsia="Times New Roman" w:cs="Times New Roman"/>
         </w:rPr>
-        <w:t>Hệ thống gồm hai nhóm chức năng chính: pipeline offline để xử lý dữ liệu và huấn luyện mô hình, cùng lớp phục vụ dự báo qua Flask/CLI. Dữ liệu raw hiện có 548,074 dòng, 400 mã cổ phiếu, giai đoạn 2019-08-14 đến 2026-06-19. Pipeline tạo cleaned data, feature data, ML dataset, model artefacts, reports và SQLite database. Giao diện Flask cho phép người dùng nhập mã cổ phiếu, nhận kết quả UP/NOT_UP, xác suất lớp UP và xem bảng đánh giá mô hình.</w:t>
+        <w:t>Hệ thống gồm pipeline offline để xử lý dữ liệu/huấn luyện và lớp phục vụ dự báo qua Flask/CLI. Raw dataset có 552,738 dòng; sau làm sạch còn 552,512 dòng; feature dataset có 514,808 dòng; ML dataset còn 512,828 dòng. Split tại 2025-06-30 tạo TRAIN 417,806 dòng và TEST 95,022 dòng. Pipeline tạo model artefacts, reports và SQLite; giao diện trả UP/NOT_UP, xác suất lớp UP và bảng đánh giá mô hình.</w:t>
       </w:r>
     </w:p>
     <w:p>
@@ -2345,6 +2471,10 @@
         <w:gridCol w:w="3024"/>
       </w:tblGrid>
       <w:tr>
+        <w:trPr>
+          <w:tblHeader/>
+          <w:cantSplit/>
+        </w:trPr>
         <w:tc>
           <w:tcPr>
             <w:tcW w:type="dxa" w:w="936"/>
@@ -2428,6 +2558,9 @@
         </w:tc>
       </w:tr>
       <w:tr>
+        <w:trPr>
+          <w:cantSplit/>
+        </w:trPr>
         <w:tc>
           <w:tcPr>
             <w:tcW w:type="dxa" w:w="3024"/>
@@ -2508,6 +2641,9 @@
         </w:tc>
       </w:tr>
       <w:tr>
+        <w:trPr>
+          <w:cantSplit/>
+        </w:trPr>
         <w:tc>
           <w:tcPr>
             <w:tcW w:type="dxa" w:w="3024"/>
@@ -2588,6 +2724,9 @@
         </w:tc>
       </w:tr>
       <w:tr>
+        <w:trPr>
+          <w:cantSplit/>
+        </w:trPr>
         <w:tc>
           <w:tcPr>
             <w:tcW w:type="dxa" w:w="3024"/>
@@ -2655,19 +2794,23 @@
             <w:pPr>
               <w:jc w:val="left"/>
             </w:pPr>
-            <w:r/>
+            <w:r>
+              <w:t>feature_engineering.py tạo 20 feature, future_return_5d và target UP/NOT_UP.</w:t>
+            </w:r>
             <w:r>
               <w:rPr>
                 <w:rFonts w:ascii="Times New Roman" w:hAnsi="Times New Roman" w:eastAsia="Times New Roman" w:cs="Times New Roman"/>
                 <w:b w:val="0"/>
                 <w:sz w:val="24"/>
               </w:rPr>
-              <w:t>feature_engineering.py tạo 15 feature, future_return_5d và target UP/NOT_UP.</w:t>
             </w:r>
           </w:p>
         </w:tc>
       </w:tr>
       <w:tr>
+        <w:trPr>
+          <w:cantSplit/>
+        </w:trPr>
         <w:tc>
           <w:tcPr>
             <w:tcW w:type="dxa" w:w="3024"/>
@@ -2735,19 +2878,23 @@
             <w:pPr>
               <w:jc w:val="left"/>
             </w:pPr>
-            <w:r/>
+            <w:r>
+              <w:t>Tuning Lab đánh giá một cấu hình/model bằng TimeSeriesSplit; cấu hình chốt được pipeline chính thức chạy lại CV và fit trên TRAIN.</w:t>
+            </w:r>
             <w:r>
               <w:rPr>
                 <w:rFonts w:ascii="Times New Roman" w:hAnsi="Times New Roman" w:eastAsia="Times New Roman" w:cs="Times New Roman"/>
                 <w:b w:val="0"/>
                 <w:sz w:val="24"/>
               </w:rPr>
-              <w:t>model_tuning.py huấn luyện baseline và tuning 3 mô hình bằng RandomizedSearchCV.</w:t>
             </w:r>
           </w:p>
         </w:tc>
       </w:tr>
       <w:tr>
+        <w:trPr>
+          <w:cantSplit/>
+        </w:trPr>
         <w:tc>
           <w:tcPr>
             <w:tcW w:type="dxa" w:w="3024"/>
@@ -2828,6 +2975,9 @@
         </w:tc>
       </w:tr>
       <w:tr>
+        <w:trPr>
+          <w:cantSplit/>
+        </w:trPr>
         <w:tc>
           <w:tcPr>
             <w:tcW w:type="dxa" w:w="3024"/>
@@ -2908,6 +3058,9 @@
         </w:tc>
       </w:tr>
       <w:tr>
+        <w:trPr>
+          <w:cantSplit/>
+        </w:trPr>
         <w:tc>
           <w:tcPr>
             <w:tcW w:type="dxa" w:w="3024"/>
@@ -2988,6 +3141,9 @@
         </w:tc>
       </w:tr>
       <w:tr>
+        <w:trPr>
+          <w:cantSplit/>
+        </w:trPr>
         <w:tc>
           <w:tcPr>
             <w:tcW w:type="dxa" w:w="3024"/>
@@ -3107,6 +3263,10 @@
         <w:gridCol w:w="3024"/>
       </w:tblGrid>
       <w:tr>
+        <w:trPr>
+          <w:tblHeader/>
+          <w:cantSplit/>
+        </w:trPr>
         <w:tc>
           <w:tcPr>
             <w:tcW w:type="dxa" w:w="1800"/>
@@ -3190,6 +3350,9 @@
         </w:tc>
       </w:tr>
       <w:tr>
+        <w:trPr>
+          <w:cantSplit/>
+        </w:trPr>
         <w:tc>
           <w:tcPr>
             <w:tcW w:type="dxa" w:w="3024"/>
@@ -3270,6 +3433,9 @@
         </w:tc>
       </w:tr>
       <w:tr>
+        <w:trPr>
+          <w:cantSplit/>
+        </w:trPr>
         <w:tc>
           <w:tcPr>
             <w:tcW w:type="dxa" w:w="3024"/>
@@ -3350,6 +3516,9 @@
         </w:tc>
       </w:tr>
       <w:tr>
+        <w:trPr>
+          <w:cantSplit/>
+        </w:trPr>
         <w:tc>
           <w:tcPr>
             <w:tcW w:type="dxa" w:w="3024"/>
@@ -3430,6 +3599,9 @@
         </w:tc>
       </w:tr>
       <w:tr>
+        <w:trPr>
+          <w:cantSplit/>
+        </w:trPr>
         <w:tc>
           <w:tcPr>
             <w:tcW w:type="dxa" w:w="3024"/>
@@ -3510,6 +3682,9 @@
         </w:tc>
       </w:tr>
       <w:tr>
+        <w:trPr>
+          <w:cantSplit/>
+        </w:trPr>
         <w:tc>
           <w:tcPr>
             <w:tcW w:type="dxa" w:w="3024"/>
@@ -3590,6 +3765,9 @@
         </w:tc>
       </w:tr>
       <w:tr>
+        <w:trPr>
+          <w:cantSplit/>
+        </w:trPr>
         <w:tc>
           <w:tcPr>
             <w:tcW w:type="dxa" w:w="3024"/>
@@ -3705,11 +3883,16 @@
       </w:r>
     </w:p>
     <w:p>
+      <w:pPr>
+        <w:keepNext/>
+        <w:keepLines/>
+        <w:jc w:val="center"/>
+      </w:pPr>
       <w:r>
         <w:drawing>
           <wp:inline xmlns:a="http://schemas.openxmlformats.org/drawingml/2006/main" xmlns:pic="http://schemas.openxmlformats.org/drawingml/2006/picture">
-            <wp:extent cx="5486400" cy="3291840"/>
-            <wp:docPr id="2" name="Picture 2"/>
+            <wp:extent cx="5486400" cy="3792071"/>
+            <wp:docPr id="6" name="Picture 6" descr="Hình 1. Kiến trúc tổng thể hệ thống" title="Hình 1. Kiến trúc tổng thể hệ thống"/>
             <wp:cNvGraphicFramePr>
               <a:graphicFrameLocks noChangeAspect="1"/>
             </wp:cNvGraphicFramePr>
@@ -3721,7 +3904,7 @@
                     <pic:cNvPicPr/>
                   </pic:nvPicPr>
                   <pic:blipFill>
-                    <a:blip r:embed="rId11"/>
+                    <a:blip r:embed="rId15"/>
                     <a:stretch>
                       <a:fillRect/>
                     </a:stretch>
@@ -3729,7 +3912,7 @@
                   <pic:spPr>
                     <a:xfrm>
                       <a:off x="0" y="0"/>
-                      <a:ext cx="5486400" cy="3291840"/>
+                      <a:ext cx="5486400" cy="3792071"/>
                     </a:xfrm>
                     <a:prstGeom prst="rect"/>
                   </pic:spPr>
@@ -3779,7 +3962,7 @@
         <w:rPr>
           <w:rFonts w:ascii="Times New Roman" w:hAnsi="Times New Roman" w:eastAsia="Times New Roman" w:cs="Times New Roman"/>
         </w:rPr>
-        <w:t>Dữ liệu được tổ chức thành nhiều tầng artefact. Sau làm sạch, hệ thống tạo 510,185 dòng feature cho 396 mã đủ điều kiện. Sau khi tạo nhãn, ML dataset còn 508,205 dòng, trong đó lớp UP chiếm 38.05% và NOT_UP chiếm 61.95%.</w:t>
+        <w:t>Dữ liệu được tổ chức thành nhiều tầng artefact. Sau tạo feature, hệ thống có 514,808 dòng của 396 mã đủ điều kiện. Sau tạo nhãn, ML dataset còn 512,828 dòng; lớp UP chiếm 37.9154% và NOT_UP chiếm 62.0846%.</w:t>
       </w:r>
     </w:p>
     <w:p>
@@ -3807,6 +3990,10 @@
         <w:gridCol w:w="3024"/>
       </w:tblGrid>
       <w:tr>
+        <w:trPr>
+          <w:tblHeader/>
+          <w:cantSplit/>
+        </w:trPr>
         <w:tc>
           <w:tcPr>
             <w:tcW w:type="dxa" w:w="2376"/>
@@ -3890,6 +4077,9 @@
         </w:tc>
       </w:tr>
       <w:tr>
+        <w:trPr>
+          <w:cantSplit/>
+        </w:trPr>
         <w:tc>
           <w:tcPr>
             <w:tcW w:type="dxa" w:w="3024"/>
@@ -3970,6 +4160,9 @@
         </w:tc>
       </w:tr>
       <w:tr>
+        <w:trPr>
+          <w:cantSplit/>
+        </w:trPr>
         <w:tc>
           <w:tcPr>
             <w:tcW w:type="dxa" w:w="3024"/>
@@ -4050,6 +4243,9 @@
         </w:tc>
       </w:tr>
       <w:tr>
+        <w:trPr>
+          <w:cantSplit/>
+        </w:trPr>
         <w:tc>
           <w:tcPr>
             <w:tcW w:type="dxa" w:w="3024"/>
@@ -4130,6 +4326,9 @@
         </w:tc>
       </w:tr>
       <w:tr>
+        <w:trPr>
+          <w:cantSplit/>
+        </w:trPr>
         <w:tc>
           <w:tcPr>
             <w:tcW w:type="dxa" w:w="3024"/>
@@ -4171,14 +4370,15 @@
             <w:pPr>
               <w:jc w:val="left"/>
             </w:pPr>
-            <w:r/>
+            <w:r>
+              <w:t>20 feature, future_return_5d, target, label_end_date</w:t>
+            </w:r>
             <w:r>
               <w:rPr>
                 <w:rFonts w:ascii="Times New Roman" w:hAnsi="Times New Roman" w:eastAsia="Times New Roman" w:cs="Times New Roman"/>
                 <w:b w:val="0"/>
                 <w:sz w:val="24"/>
               </w:rPr>
-              <w:t>15 feature, future_return_5d, target, label_end_date</w:t>
             </w:r>
           </w:p>
         </w:tc>
@@ -4210,6 +4410,9 @@
         </w:tc>
       </w:tr>
       <w:tr>
+        <w:trPr>
+          <w:cantSplit/>
+        </w:trPr>
         <w:tc>
           <w:tcPr>
             <w:tcW w:type="dxa" w:w="3024"/>
@@ -4290,6 +4493,9 @@
         </w:tc>
       </w:tr>
       <w:tr>
+        <w:trPr>
+          <w:cantSplit/>
+        </w:trPr>
         <w:tc>
           <w:tcPr>
             <w:tcW w:type="dxa" w:w="3024"/>
@@ -4374,11 +4580,16 @@
       <w:pPr/>
     </w:p>
     <w:p>
+      <w:pPr>
+        <w:keepNext/>
+        <w:keepLines/>
+        <w:jc w:val="center"/>
+      </w:pPr>
       <w:r>
         <w:drawing>
           <wp:inline xmlns:a="http://schemas.openxmlformats.org/drawingml/2006/main" xmlns:pic="http://schemas.openxmlformats.org/drawingml/2006/picture">
-            <wp:extent cx="5486400" cy="3291840"/>
-            <wp:docPr id="3" name="Picture 3"/>
+            <wp:extent cx="5486400" cy="4165600"/>
+            <wp:docPr id="7" name="Picture 7" descr="Hình 2. Luồng dữ liệu và huấn luyện mô hình" title="Hình 2. Luồng dữ liệu và huấn luyện mô hình"/>
             <wp:cNvGraphicFramePr>
               <a:graphicFrameLocks noChangeAspect="1"/>
             </wp:cNvGraphicFramePr>
@@ -4390,7 +4601,7 @@
                     <pic:cNvPicPr/>
                   </pic:nvPicPr>
                   <pic:blipFill>
-                    <a:blip r:embed="rId12"/>
+                    <a:blip r:embed="rId16"/>
                     <a:stretch>
                       <a:fillRect/>
                     </a:stretch>
@@ -4398,7 +4609,7 @@
                   <pic:spPr>
                     <a:xfrm>
                       <a:off x="0" y="0"/>
-                      <a:ext cx="5486400" cy="3291840"/>
+                      <a:ext cx="5486400" cy="4165600"/>
                     </a:xfrm>
                     <a:prstGeom prst="rect"/>
                   </pic:spPr>
@@ -4434,6 +4645,7 @@
     <w:p>
       <w:pPr>
         <w:pStyle w:val="Heading3"/>
+        <w:pageBreakBefore/>
       </w:pPr>
       <w:r>
         <w:rPr>
@@ -4479,7 +4691,7 @@
         <w:rPr>
           <w:rFonts w:ascii="Times New Roman" w:hAnsi="Times New Roman" w:eastAsia="Times New Roman" w:cs="Times New Roman"/>
         </w:rPr>
-        <w:t>feature_engineering.py tính feature theo từng nhóm symbol. Các rolling feature như SMA, RSI và volatility dùng lịch sử quá khứ của chính mã đó. create_labels dịch close(t+5) về hiện tại để tạo future_return_5d và target. time_based_split chia dữ liệu thành train nếu label_end_date &lt;= 2025-12-31 và test nếu label_end_date &gt; 2025-12-31.</w:t>
+        <w:t>feature_engineering.py tính feature riêng theo từng symbol. Các rolling feature chỉ dùng lịch sử quá khứ của chính mã đó. create_labels dịch close(t+5) về hiện tại để tạo future_return_5d và target. time_based_split dùng label_end_date: TRAIN nếu label_end_date &lt;= 2025-06-30, TEST nếu label_end_date &gt; 2025-06-30; không shuffle.</w:t>
       </w:r>
     </w:p>
     <w:p>
@@ -4499,7 +4711,175 @@
         <w:rPr>
           <w:rFonts w:ascii="Times New Roman" w:hAnsi="Times New Roman" w:eastAsia="Times New Roman" w:cs="Times New Roman"/>
         </w:rPr>
-        <w:t>model_tuning.py huấn luyện Dummy Classifier làm baseline và tuning Logistic Regression, Random Forest, Gradient Boosting bằng RandomizedSearchCV. Logistic Regression được đặt trong Pipeline với StandardScaler; Random Forest dùng class_weight='balanced_subsample'; Gradient Boosting dùng các tham số n_estimators, learning_rate, max_depth và subsample. model_evaluation.py đánh giá trên test set, chọn mô hình theo F1_UP giảm dần, tie-break bằng Recall_UP và độ đơn giản.</w:t>
+        <w:t>Tuning Lab đánh giá thủ công một cấu hình cho mỗi lần chạy bằng TimeSeriesSplit trên TRAIN, ghi lịch sử và chốt một cấu hình đúng fingerprint cho Logistic Regression, Random Forest và Gradient Boosting. Pipeline chính thức dựng lại ba estimator, chạy lại CV, fit toàn TRAIN và chốt decision threshold; Dummy Classifier chỉ là baseline. Hình 3-Hình 5 làm rõ hyperparameter được thay đổi và bộ tham số được chốt của từng model.</w:t>
+      </w:r>
+    </w:p>
+    <w:p>
+      <w:pPr>
+        <w:keepNext/>
+        <w:keepLines/>
+        <w:jc w:val="center"/>
+      </w:pPr>
+      <w:r>
+        <w:drawing>
+          <wp:inline xmlns:a="http://schemas.openxmlformats.org/drawingml/2006/main" xmlns:pic="http://schemas.openxmlformats.org/drawingml/2006/picture">
+            <wp:extent cx="5486400" cy="4114800"/>
+            <wp:docPr id="10" name="Picture 10" descr="Hình 3. Quy trình tuning Logistic Regression" title="Hình 3. Quy trình tuning Logistic Regression"/>
+            <wp:cNvGraphicFramePr>
+              <a:graphicFrameLocks noChangeAspect="1"/>
+            </wp:cNvGraphicFramePr>
+            <a:graphic>
+              <a:graphicData uri="http://schemas.openxmlformats.org/drawingml/2006/picture">
+                <pic:pic>
+                  <pic:nvPicPr>
+                    <pic:cNvPr id="0" name="figure_3_cropped.png"/>
+                    <pic:cNvPicPr/>
+                  </pic:nvPicPr>
+                  <pic:blipFill>
+                    <a:blip r:embed="rId19"/>
+                    <a:stretch>
+                      <a:fillRect/>
+                    </a:stretch>
+                  </pic:blipFill>
+                  <pic:spPr>
+                    <a:xfrm>
+                      <a:off x="0" y="0"/>
+                      <a:ext cx="5486400" cy="4114800"/>
+                    </a:xfrm>
+                    <a:prstGeom prst="rect"/>
+                  </pic:spPr>
+                </pic:pic>
+              </a:graphicData>
+            </a:graphic>
+          </wp:inline>
+        </w:drawing>
+      </w:r>
+    </w:p>
+    <w:p>
+      <w:pPr>
+        <w:keepNext w:val="0"/>
+        <w:keepLines/>
+        <w:jc w:val="center"/>
+      </w:pPr>
+      <w:r>
+        <w:rPr>
+          <w:rFonts w:ascii="Times New Roman" w:hAnsi="Times New Roman" w:eastAsia="Times New Roman" w:cs="Times New Roman"/>
+          <w:i/>
+          <w:sz w:val="26"/>
+        </w:rPr>
+        <w:t>Hình 3. Quy trình tuning Logistic Regression</w:t>
+      </w:r>
+    </w:p>
+    <w:p>
+      <w:pPr>
+        <w:keepNext/>
+        <w:keepLines/>
+        <w:jc w:val="center"/>
+      </w:pPr>
+      <w:r>
+        <w:drawing>
+          <wp:inline xmlns:a="http://schemas.openxmlformats.org/drawingml/2006/main" xmlns:pic="http://schemas.openxmlformats.org/drawingml/2006/picture">
+            <wp:extent cx="5486400" cy="4114800"/>
+            <wp:docPr id="11" name="Picture 11" descr="Hình 4. Quy trình tuning Random Forest" title="Hình 4. Quy trình tuning Random Forest"/>
+            <wp:cNvGraphicFramePr>
+              <a:graphicFrameLocks noChangeAspect="1"/>
+            </wp:cNvGraphicFramePr>
+            <a:graphic>
+              <a:graphicData uri="http://schemas.openxmlformats.org/drawingml/2006/picture">
+                <pic:pic>
+                  <pic:nvPicPr>
+                    <pic:cNvPr id="0" name="figure_4_cropped.png"/>
+                    <pic:cNvPicPr/>
+                  </pic:nvPicPr>
+                  <pic:blipFill>
+                    <a:blip r:embed="rId20"/>
+                    <a:stretch>
+                      <a:fillRect/>
+                    </a:stretch>
+                  </pic:blipFill>
+                  <pic:spPr>
+                    <a:xfrm>
+                      <a:off x="0" y="0"/>
+                      <a:ext cx="5486400" cy="4114800"/>
+                    </a:xfrm>
+                    <a:prstGeom prst="rect"/>
+                  </pic:spPr>
+                </pic:pic>
+              </a:graphicData>
+            </a:graphic>
+          </wp:inline>
+        </w:drawing>
+      </w:r>
+    </w:p>
+    <w:p>
+      <w:pPr>
+        <w:keepNext w:val="0"/>
+        <w:keepLines/>
+        <w:jc w:val="center"/>
+      </w:pPr>
+      <w:r>
+        <w:rPr>
+          <w:rFonts w:ascii="Times New Roman" w:hAnsi="Times New Roman" w:eastAsia="Times New Roman" w:cs="Times New Roman"/>
+          <w:i/>
+          <w:sz w:val="26"/>
+        </w:rPr>
+        <w:t>Hình 4. Quy trình tuning Random Forest</w:t>
+      </w:r>
+    </w:p>
+    <w:p>
+      <w:pPr>
+        <w:keepNext/>
+        <w:keepLines/>
+        <w:jc w:val="center"/>
+      </w:pPr>
+      <w:r>
+        <w:drawing>
+          <wp:inline xmlns:a="http://schemas.openxmlformats.org/drawingml/2006/main" xmlns:pic="http://schemas.openxmlformats.org/drawingml/2006/picture">
+            <wp:extent cx="5486400" cy="4114800"/>
+            <wp:docPr id="12" name="Picture 12" descr="Hình 5. Quy trình tuning Gradient Boosting" title="Hình 5. Quy trình tuning Gradient Boosting"/>
+            <wp:cNvGraphicFramePr>
+              <a:graphicFrameLocks noChangeAspect="1"/>
+            </wp:cNvGraphicFramePr>
+            <a:graphic>
+              <a:graphicData uri="http://schemas.openxmlformats.org/drawingml/2006/picture">
+                <pic:pic>
+                  <pic:nvPicPr>
+                    <pic:cNvPr id="0" name="figure_5_cropped.png"/>
+                    <pic:cNvPicPr/>
+                  </pic:nvPicPr>
+                  <pic:blipFill>
+                    <a:blip r:embed="rId21"/>
+                    <a:stretch>
+                      <a:fillRect/>
+                    </a:stretch>
+                  </pic:blipFill>
+                  <pic:spPr>
+                    <a:xfrm>
+                      <a:off x="0" y="0"/>
+                      <a:ext cx="5486400" cy="4114800"/>
+                    </a:xfrm>
+                    <a:prstGeom prst="rect"/>
+                  </pic:spPr>
+                </pic:pic>
+              </a:graphicData>
+            </a:graphic>
+          </wp:inline>
+        </w:drawing>
+      </w:r>
+    </w:p>
+    <w:p>
+      <w:pPr>
+        <w:keepNext w:val="0"/>
+        <w:keepLines/>
+        <w:jc w:val="center"/>
+      </w:pPr>
+      <w:r>
+        <w:rPr>
+          <w:rFonts w:ascii="Times New Roman" w:hAnsi="Times New Roman" w:eastAsia="Times New Roman" w:cs="Times New Roman"/>
+          <w:i/>
+          <w:sz w:val="26"/>
+        </w:rPr>
+        <w:t>Hình 5. Quy trình tuning Gradient Boosting</w:t>
       </w:r>
     </w:p>
     <w:p>
@@ -4570,6 +4950,10 @@
         <w:gridCol w:w="2268"/>
       </w:tblGrid>
       <w:tr>
+        <w:trPr>
+          <w:tblHeader/>
+          <w:cantSplit/>
+        </w:trPr>
         <w:tc>
           <w:tcPr>
             <w:tcW w:type="dxa" w:w="1224"/>
@@ -4680,6 +5064,9 @@
         </w:tc>
       </w:tr>
       <w:tr>
+        <w:trPr>
+          <w:cantSplit/>
+        </w:trPr>
         <w:tc>
           <w:tcPr>
             <w:tcW w:type="dxa" w:w="2268"/>
@@ -4786,6 +5173,9 @@
         </w:tc>
       </w:tr>
       <w:tr>
+        <w:trPr>
+          <w:cantSplit/>
+        </w:trPr>
         <w:tc>
           <w:tcPr>
             <w:tcW w:type="dxa" w:w="2268"/>
@@ -4892,6 +5282,9 @@
         </w:tc>
       </w:tr>
       <w:tr>
+        <w:trPr>
+          <w:cantSplit/>
+        </w:trPr>
         <w:tc>
           <w:tcPr>
             <w:tcW w:type="dxa" w:w="2268"/>
@@ -4998,6 +5391,9 @@
         </w:tc>
       </w:tr>
       <w:tr>
+        <w:trPr>
+          <w:cantSplit/>
+        </w:trPr>
         <w:tc>
           <w:tcPr>
             <w:tcW w:type="dxa" w:w="2268"/>
@@ -5146,6 +5542,10 @@
         <w:gridCol w:w="1512"/>
       </w:tblGrid>
       <w:tr>
+        <w:trPr>
+          <w:tblHeader/>
+          <w:cantSplit/>
+        </w:trPr>
         <w:tc>
           <w:tcPr>
             <w:tcW w:type="dxa" w:w="2088"/>
@@ -5162,14 +5562,15 @@
             <w:pPr>
               <w:jc w:val="center"/>
             </w:pPr>
-            <w:r/>
+            <w:r>
+              <w:t>Model</w:t>
+            </w:r>
             <w:r>
               <w:rPr>
                 <w:rFonts w:ascii="Times New Roman" w:hAnsi="Times New Roman" w:eastAsia="Times New Roman" w:cs="Times New Roman"/>
                 <w:b/>
                 <w:sz w:val="24"/>
               </w:rPr>
-              <w:t>Model</w:t>
             </w:r>
           </w:p>
         </w:tc>
@@ -5189,14 +5590,15 @@
             <w:pPr>
               <w:jc w:val="center"/>
             </w:pPr>
-            <w:r/>
+            <w:r>
+              <w:t>Accuracy</w:t>
+            </w:r>
             <w:r>
               <w:rPr>
                 <w:rFonts w:ascii="Times New Roman" w:hAnsi="Times New Roman" w:eastAsia="Times New Roman" w:cs="Times New Roman"/>
                 <w:b/>
                 <w:sz w:val="24"/>
               </w:rPr>
-              <w:t>Accuracy</w:t>
             </w:r>
           </w:p>
         </w:tc>
@@ -5216,14 +5618,15 @@
             <w:pPr>
               <w:jc w:val="center"/>
             </w:pPr>
-            <w:r/>
+            <w:r>
+              <w:t>Recall_UP</w:t>
+            </w:r>
             <w:r>
               <w:rPr>
                 <w:rFonts w:ascii="Times New Roman" w:hAnsi="Times New Roman" w:eastAsia="Times New Roman" w:cs="Times New Roman"/>
                 <w:b/>
                 <w:sz w:val="24"/>
               </w:rPr>
-              <w:t>Recall_UP</w:t>
             </w:r>
           </w:p>
         </w:tc>
@@ -5243,14 +5646,15 @@
             <w:pPr>
               <w:jc w:val="center"/>
             </w:pPr>
-            <w:r/>
+            <w:r>
+              <w:t>F1_UP</w:t>
+            </w:r>
             <w:r>
               <w:rPr>
                 <w:rFonts w:ascii="Times New Roman" w:hAnsi="Times New Roman" w:eastAsia="Times New Roman" w:cs="Times New Roman"/>
                 <w:b/>
                 <w:sz w:val="24"/>
               </w:rPr>
-              <w:t>F1_UP</w:t>
             </w:r>
           </w:p>
         </w:tc>
@@ -5270,14 +5674,15 @@
             <w:pPr>
               <w:jc w:val="center"/>
             </w:pPr>
-            <w:r/>
+            <w:r>
+              <w:t>CV F1_UP (official)</w:t>
+            </w:r>
             <w:r>
               <w:rPr>
                 <w:rFonts w:ascii="Times New Roman" w:hAnsi="Times New Roman" w:eastAsia="Times New Roman" w:cs="Times New Roman"/>
                 <w:b/>
                 <w:sz w:val="24"/>
               </w:rPr>
-              <w:t>CV F1_UP</w:t>
             </w:r>
           </w:p>
         </w:tc>
@@ -5297,19 +5702,23 @@
             <w:pPr>
               <w:jc w:val="center"/>
             </w:pPr>
-            <w:r/>
+            <w:r>
+              <w:t>Chọn</w:t>
+            </w:r>
             <w:r>
               <w:rPr>
                 <w:rFonts w:ascii="Times New Roman" w:hAnsi="Times New Roman" w:eastAsia="Times New Roman" w:cs="Times New Roman"/>
                 <w:b/>
                 <w:sz w:val="24"/>
               </w:rPr>
-              <w:t>Chọn</w:t>
             </w:r>
           </w:p>
         </w:tc>
       </w:tr>
       <w:tr>
+        <w:trPr>
+          <w:cantSplit/>
+        </w:trPr>
         <w:tc>
           <w:tcPr>
             <w:tcW w:type="dxa" w:w="1512"/>
@@ -5325,14 +5734,15 @@
             <w:pPr>
               <w:jc w:val="center"/>
             </w:pPr>
-            <w:r/>
+            <w:r>
+              <w:t>Dummy Classifier</w:t>
+            </w:r>
             <w:r>
               <w:rPr>
                 <w:rFonts w:ascii="Times New Roman" w:hAnsi="Times New Roman" w:eastAsia="Times New Roman" w:cs="Times New Roman"/>
                 <w:b w:val="0"/>
                 <w:sz w:val="24"/>
               </w:rPr>
-              <w:t>Dummy Classifier</w:t>
             </w:r>
           </w:p>
         </w:tc>
@@ -5351,14 +5761,15 @@
             <w:pPr>
               <w:jc w:val="left"/>
             </w:pPr>
-            <w:r/>
+            <w:r>
+              <w:t>0.6720</w:t>
+            </w:r>
             <w:r>
               <w:rPr>
                 <w:rFonts w:ascii="Times New Roman" w:hAnsi="Times New Roman" w:eastAsia="Times New Roman" w:cs="Times New Roman"/>
                 <w:b w:val="0"/>
                 <w:sz w:val="24"/>
               </w:rPr>
-              <w:t>0.6899</w:t>
             </w:r>
           </w:p>
         </w:tc>
@@ -5377,14 +5788,15 @@
             <w:pPr>
               <w:jc w:val="left"/>
             </w:pPr>
-            <w:r/>
+            <w:r>
+              <w:t>0.0000</w:t>
+            </w:r>
             <w:r>
               <w:rPr>
                 <w:rFonts w:ascii="Times New Roman" w:hAnsi="Times New Roman" w:eastAsia="Times New Roman" w:cs="Times New Roman"/>
                 <w:b w:val="0"/>
                 <w:sz w:val="24"/>
               </w:rPr>
-              <w:t>0.0000</w:t>
             </w:r>
           </w:p>
         </w:tc>
@@ -5403,14 +5815,15 @@
             <w:pPr>
               <w:jc w:val="left"/>
             </w:pPr>
-            <w:r/>
+            <w:r>
+              <w:t>0.0000</w:t>
+            </w:r>
             <w:r>
               <w:rPr>
                 <w:rFonts w:ascii="Times New Roman" w:hAnsi="Times New Roman" w:eastAsia="Times New Roman" w:cs="Times New Roman"/>
                 <w:b w:val="0"/>
                 <w:sz w:val="24"/>
               </w:rPr>
-              <w:t>0.0000</w:t>
             </w:r>
           </w:p>
         </w:tc>
@@ -5429,14 +5842,15 @@
             <w:pPr>
               <w:jc w:val="left"/>
             </w:pPr>
-            <w:r/>
+            <w:r>
+              <w:t>-</w:t>
+            </w:r>
             <w:r>
               <w:rPr>
                 <w:rFonts w:ascii="Times New Roman" w:hAnsi="Times New Roman" w:eastAsia="Times New Roman" w:cs="Times New Roman"/>
                 <w:b w:val="0"/>
                 <w:sz w:val="24"/>
               </w:rPr>
-              <w:t>-</w:t>
             </w:r>
           </w:p>
         </w:tc>
@@ -5455,19 +5869,23 @@
             <w:pPr>
               <w:jc w:val="left"/>
             </w:pPr>
-            <w:r/>
+            <w:r>
+              <w:t>Không</w:t>
+            </w:r>
             <w:r>
               <w:rPr>
                 <w:rFonts w:ascii="Times New Roman" w:hAnsi="Times New Roman" w:eastAsia="Times New Roman" w:cs="Times New Roman"/>
                 <w:b w:val="0"/>
                 <w:sz w:val="24"/>
               </w:rPr>
-              <w:t>Không</w:t>
             </w:r>
           </w:p>
         </w:tc>
       </w:tr>
       <w:tr>
+        <w:trPr>
+          <w:cantSplit/>
+        </w:trPr>
         <w:tc>
           <w:tcPr>
             <w:tcW w:type="dxa" w:w="1512"/>
@@ -5483,14 +5901,15 @@
             <w:pPr>
               <w:jc w:val="center"/>
             </w:pPr>
-            <w:r/>
+            <w:r>
+              <w:t>Logistic Regression</w:t>
+            </w:r>
             <w:r>
               <w:rPr>
                 <w:rFonts w:ascii="Times New Roman" w:hAnsi="Times New Roman" w:eastAsia="Times New Roman" w:cs="Times New Roman"/>
                 <w:b w:val="0"/>
                 <w:sz w:val="24"/>
               </w:rPr>
-              <w:t>Logistic Regression</w:t>
             </w:r>
           </w:p>
         </w:tc>
@@ -5509,14 +5928,15 @@
             <w:pPr>
               <w:jc w:val="left"/>
             </w:pPr>
-            <w:r/>
+            <w:r>
+              <w:t>0.3938</w:t>
+            </w:r>
             <w:r>
               <w:rPr>
                 <w:rFonts w:ascii="Times New Roman" w:hAnsi="Times New Roman" w:eastAsia="Times New Roman" w:cs="Times New Roman"/>
                 <w:b w:val="0"/>
                 <w:sz w:val="24"/>
               </w:rPr>
-              <w:t>0.6050</w:t>
             </w:r>
           </w:p>
         </w:tc>
@@ -5535,14 +5955,15 @@
             <w:pPr>
               <w:jc w:val="left"/>
             </w:pPr>
-            <w:r/>
+            <w:r>
+              <w:t>0.9332</w:t>
+            </w:r>
             <w:r>
               <w:rPr>
                 <w:rFonts w:ascii="Times New Roman" w:hAnsi="Times New Roman" w:eastAsia="Times New Roman" w:cs="Times New Roman"/>
                 <w:b w:val="0"/>
                 <w:sz w:val="24"/>
               </w:rPr>
-              <w:t>0.4226</w:t>
             </w:r>
           </w:p>
         </w:tc>
@@ -5561,14 +5982,15 @@
             <w:pPr>
               <w:jc w:val="left"/>
             </w:pPr>
-            <w:r/>
+            <w:r>
+              <w:t>0.5024</w:t>
+            </w:r>
             <w:r>
               <w:rPr>
                 <w:rFonts w:ascii="Times New Roman" w:hAnsi="Times New Roman" w:eastAsia="Times New Roman" w:cs="Times New Roman"/>
                 <w:b w:val="0"/>
                 <w:sz w:val="24"/>
               </w:rPr>
-              <w:t>0.3989</w:t>
             </w:r>
           </w:p>
         </w:tc>
@@ -5587,14 +6009,15 @@
             <w:pPr>
               <w:jc w:val="left"/>
             </w:pPr>
-            <w:r/>
+            <w:r>
+              <w:t>0.5490</w:t>
+            </w:r>
             <w:r>
               <w:rPr>
                 <w:rFonts w:ascii="Times New Roman" w:hAnsi="Times New Roman" w:eastAsia="Times New Roman" w:cs="Times New Roman"/>
                 <w:b w:val="0"/>
                 <w:sz w:val="24"/>
               </w:rPr>
-              <w:t>0.4172</w:t>
             </w:r>
           </w:p>
         </w:tc>
@@ -5613,19 +6036,23 @@
             <w:pPr>
               <w:jc w:val="left"/>
             </w:pPr>
-            <w:r/>
+            <w:r>
+              <w:t>Không</w:t>
+            </w:r>
             <w:r>
               <w:rPr>
                 <w:rFonts w:ascii="Times New Roman" w:hAnsi="Times New Roman" w:eastAsia="Times New Roman" w:cs="Times New Roman"/>
                 <w:b w:val="0"/>
                 <w:sz w:val="24"/>
               </w:rPr>
-              <w:t>Không</w:t>
             </w:r>
           </w:p>
         </w:tc>
       </w:tr>
       <w:tr>
+        <w:trPr>
+          <w:cantSplit/>
+        </w:trPr>
         <w:tc>
           <w:tcPr>
             <w:tcW w:type="dxa" w:w="1512"/>
@@ -5641,14 +6068,15 @@
             <w:pPr>
               <w:jc w:val="center"/>
             </w:pPr>
-            <w:r/>
+            <w:r>
+              <w:t>Random Forest</w:t>
+            </w:r>
             <w:r>
               <w:rPr>
                 <w:rFonts w:ascii="Times New Roman" w:hAnsi="Times New Roman" w:eastAsia="Times New Roman" w:cs="Times New Roman"/>
                 <w:b w:val="0"/>
                 <w:sz w:val="24"/>
               </w:rPr>
-              <w:t>Random Forest</w:t>
             </w:r>
           </w:p>
         </w:tc>
@@ -5667,14 +6095,15 @@
             <w:pPr>
               <w:jc w:val="left"/>
             </w:pPr>
-            <w:r/>
+            <w:r>
+              <w:t>0.3918</w:t>
+            </w:r>
             <w:r>
               <w:rPr>
                 <w:rFonts w:ascii="Times New Roman" w:hAnsi="Times New Roman" w:eastAsia="Times New Roman" w:cs="Times New Roman"/>
                 <w:b w:val="0"/>
                 <w:sz w:val="24"/>
               </w:rPr>
-              <w:t>0.5926</w:t>
             </w:r>
           </w:p>
         </w:tc>
@@ -5693,14 +6122,15 @@
             <w:pPr>
               <w:jc w:val="left"/>
             </w:pPr>
-            <w:r/>
+            <w:r>
+              <w:t>0.9424</w:t>
+            </w:r>
             <w:r>
               <w:rPr>
                 <w:rFonts w:ascii="Times New Roman" w:hAnsi="Times New Roman" w:eastAsia="Times New Roman" w:cs="Times New Roman"/>
                 <w:b w:val="0"/>
                 <w:sz w:val="24"/>
               </w:rPr>
-              <w:t>0.5142</w:t>
             </w:r>
           </w:p>
         </w:tc>
@@ -5719,14 +6149,15 @@
             <w:pPr>
               <w:jc w:val="left"/>
             </w:pPr>
-            <w:r/>
+            <w:r>
+              <w:t>0.5041</w:t>
+            </w:r>
             <w:r>
               <w:rPr>
                 <w:rFonts w:ascii="Times New Roman" w:hAnsi="Times New Roman" w:eastAsia="Times New Roman" w:cs="Times New Roman"/>
                 <w:b w:val="0"/>
                 <w:sz w:val="24"/>
               </w:rPr>
-              <w:t>0.4391</w:t>
             </w:r>
           </w:p>
         </w:tc>
@@ -5745,14 +6176,15 @@
             <w:pPr>
               <w:jc w:val="left"/>
             </w:pPr>
-            <w:r/>
+            <w:r>
+              <w:t>0.5488</w:t>
+            </w:r>
             <w:r>
               <w:rPr>
                 <w:rFonts w:ascii="Times New Roman" w:hAnsi="Times New Roman" w:eastAsia="Times New Roman" w:cs="Times New Roman"/>
                 <w:b w:val="0"/>
                 <w:sz w:val="24"/>
               </w:rPr>
-              <w:t>0.4540</w:t>
             </w:r>
           </w:p>
         </w:tc>
@@ -5771,19 +6203,23 @@
             <w:pPr>
               <w:jc w:val="left"/>
             </w:pPr>
-            <w:r/>
+            <w:r>
+              <w:t>Không</w:t>
+            </w:r>
             <w:r>
               <w:rPr>
                 <w:rFonts w:ascii="Times New Roman" w:hAnsi="Times New Roman" w:eastAsia="Times New Roman" w:cs="Times New Roman"/>
                 <w:b w:val="0"/>
                 <w:sz w:val="24"/>
               </w:rPr>
-              <w:t>Có</w:t>
             </w:r>
           </w:p>
         </w:tc>
       </w:tr>
       <w:tr>
+        <w:trPr>
+          <w:cantSplit/>
+        </w:trPr>
         <w:tc>
           <w:tcPr>
             <w:tcW w:type="dxa" w:w="1512"/>
@@ -5799,14 +6235,15 @@
             <w:pPr>
               <w:jc w:val="center"/>
             </w:pPr>
-            <w:r/>
+            <w:r>
+              <w:t>Gradient Boosting</w:t>
+            </w:r>
             <w:r>
               <w:rPr>
                 <w:rFonts w:ascii="Times New Roman" w:hAnsi="Times New Roman" w:eastAsia="Times New Roman" w:cs="Times New Roman"/>
                 <w:b w:val="0"/>
                 <w:sz w:val="24"/>
               </w:rPr>
-              <w:t>Gradient Boosting</w:t>
             </w:r>
           </w:p>
         </w:tc>
@@ -5825,14 +6262,15 @@
             <w:pPr>
               <w:jc w:val="left"/>
             </w:pPr>
-            <w:r/>
+            <w:r>
+              <w:t>0.4108</w:t>
+            </w:r>
             <w:r>
               <w:rPr>
                 <w:rFonts w:ascii="Times New Roman" w:hAnsi="Times New Roman" w:eastAsia="Times New Roman" w:cs="Times New Roman"/>
                 <w:b w:val="0"/>
                 <w:sz w:val="24"/>
               </w:rPr>
-              <w:t>0.6905</w:t>
             </w:r>
           </w:p>
         </w:tc>
@@ -5851,14 +6289,15 @@
             <w:pPr>
               <w:jc w:val="left"/>
             </w:pPr>
-            <w:r/>
+            <w:r>
+              <w:t>0.9176</w:t>
+            </w:r>
             <w:r>
               <w:rPr>
                 <w:rFonts w:ascii="Times New Roman" w:hAnsi="Times New Roman" w:eastAsia="Times New Roman" w:cs="Times New Roman"/>
                 <w:b w:val="0"/>
                 <w:sz w:val="24"/>
               </w:rPr>
-              <w:t>0.0476</w:t>
             </w:r>
           </w:p>
         </w:tc>
@@ -5877,14 +6316,15 @@
             <w:pPr>
               <w:jc w:val="left"/>
             </w:pPr>
-            <w:r/>
+            <w:r>
+              <w:t>0.5053</w:t>
+            </w:r>
             <w:r>
               <w:rPr>
                 <w:rFonts w:ascii="Times New Roman" w:hAnsi="Times New Roman" w:eastAsia="Times New Roman" w:cs="Times New Roman"/>
                 <w:b w:val="0"/>
                 <w:sz w:val="24"/>
               </w:rPr>
-              <w:t>0.0870</w:t>
             </w:r>
           </w:p>
         </w:tc>
@@ -5903,14 +6343,15 @@
             <w:pPr>
               <w:jc w:val="left"/>
             </w:pPr>
-            <w:r/>
+            <w:r>
+              <w:t>0.5453</w:t>
+            </w:r>
             <w:r>
               <w:rPr>
                 <w:rFonts w:ascii="Times New Roman" w:hAnsi="Times New Roman" w:eastAsia="Times New Roman" w:cs="Times New Roman"/>
                 <w:b w:val="0"/>
                 <w:sz w:val="24"/>
               </w:rPr>
-              <w:t>0.1860</w:t>
             </w:r>
           </w:p>
         </w:tc>
@@ -5929,14 +6370,15 @@
             <w:pPr>
               <w:jc w:val="left"/>
             </w:pPr>
-            <w:r/>
+            <w:r>
+              <w:t>Có</w:t>
+            </w:r>
             <w:r>
               <w:rPr>
                 <w:rFonts w:ascii="Times New Roman" w:hAnsi="Times New Roman" w:eastAsia="Times New Roman" w:cs="Times New Roman"/>
                 <w:b w:val="0"/>
                 <w:sz w:val="24"/>
               </w:rPr>
-              <w:t>Không</w:t>
             </w:r>
           </w:p>
         </w:tc>
@@ -5946,12 +6388,68 @@
       <w:pPr/>
     </w:p>
     <w:p>
+      <w:pPr>
+        <w:keepNext/>
+        <w:keepLines/>
+        <w:jc w:val="center"/>
+      </w:pPr>
+      <w:r>
+        <w:drawing>
+          <wp:inline xmlns:a="http://schemas.openxmlformats.org/drawingml/2006/main" xmlns:pic="http://schemas.openxmlformats.org/drawingml/2006/picture">
+            <wp:extent cx="5486400" cy="4114800"/>
+            <wp:docPr id="13" name="Picture 13" descr="Hình 6. Đánh giá ba mô hình trên TEST và lựa chọn Final Model" title="Hình 6. Đánh giá ba mô hình trên TEST và lựa chọn Final Model"/>
+            <wp:cNvGraphicFramePr>
+              <a:graphicFrameLocks noChangeAspect="1"/>
+            </wp:cNvGraphicFramePr>
+            <a:graphic>
+              <a:graphicData uri="http://schemas.openxmlformats.org/drawingml/2006/picture">
+                <pic:pic>
+                  <pic:nvPicPr>
+                    <pic:cNvPr id="0" name="figure_6_cropped.png"/>
+                    <pic:cNvPicPr/>
+                  </pic:nvPicPr>
+                  <pic:blipFill>
+                    <a:blip r:embed="rId22"/>
+                    <a:stretch>
+                      <a:fillRect/>
+                    </a:stretch>
+                  </pic:blipFill>
+                  <pic:spPr>
+                    <a:xfrm>
+                      <a:off x="0" y="0"/>
+                      <a:ext cx="5486400" cy="4114800"/>
+                    </a:xfrm>
+                    <a:prstGeom prst="rect"/>
+                  </pic:spPr>
+                </pic:pic>
+              </a:graphicData>
+            </a:graphic>
+          </wp:inline>
+        </w:drawing>
+      </w:r>
+    </w:p>
+    <w:p>
+      <w:pPr>
+        <w:keepNext w:val="0"/>
+        <w:keepLines/>
+        <w:jc w:val="center"/>
+      </w:pPr>
+      <w:r>
+        <w:rPr>
+          <w:rFonts w:ascii="Times New Roman" w:hAnsi="Times New Roman" w:eastAsia="Times New Roman" w:cs="Times New Roman"/>
+          <w:i/>
+          <w:sz w:val="26"/>
+        </w:rPr>
+        <w:t>Hình 6. Đánh giá ba mô hình trên TEST và lựa chọn Final Model</w:t>
+      </w:r>
+    </w:p>
+    <w:p>
       <w:pPr/>
       <w:r>
         <w:rPr>
           <w:rFonts w:ascii="Times New Roman" w:hAnsi="Times New Roman" w:eastAsia="Times New Roman" w:cs="Times New Roman"/>
         </w:rPr>
-        <w:t>Dummy Classifier đạt Accuracy cao vì lớp NOT_UP chiếm đa số, nhưng F1_UP bằng 0 nên không có giá trị cho mục tiêu phát hiện UP. Gradient Boosting đạt Accuracy 0.6905 nhưng Recall_UP chỉ 0.0476, nghĩa là bỏ sót phần lớn trường hợp thật sự UP. Random Forest có F1_UP cao nhất trong các mô hình chính và Recall_UP cao nhất, nên được chọn làm final model.</w:t>
+        <w:t>Bảng 7 và Hình 6 cho thấy Dummy Classifier có Accuracy 0.6720 nhưng F1_UP bằng 0 và bị loại trước khi xếp hạng. Final Model được chọn bằng TEST F1_UP, sau đó Recall_UP nếu F1_UP bằng nhau, rồi độ đơn giản. Gradient Boosting có TEST F1_UP cao nhất 0.5053, nhỉnh hơn Random Forest 0.5041 và Logistic Regression 0.5024; official CV không dùng để chọn Final Model.</w:t>
       </w:r>
     </w:p>
     <w:p>
@@ -5979,6 +6477,10 @@
         <w:gridCol w:w="3024"/>
       </w:tblGrid>
       <w:tr>
+        <w:trPr>
+          <w:tblHeader/>
+          <w:cantSplit/>
+        </w:trPr>
         <w:tc>
           <w:tcPr>
             <w:tcW w:type="dxa" w:w="3168"/>
@@ -5995,14 +6497,15 @@
             <w:pPr>
               <w:jc w:val="center"/>
             </w:pPr>
-            <w:r/>
+            <w:r>
+              <w:t>Thực tế / Dự báo</w:t>
+            </w:r>
             <w:r>
               <w:rPr>
                 <w:rFonts w:ascii="Times New Roman" w:hAnsi="Times New Roman" w:eastAsia="Times New Roman" w:cs="Times New Roman"/>
                 <w:b/>
                 <w:sz w:val="24"/>
               </w:rPr>
-              <w:t>Thực tế / Dự báo</w:t>
             </w:r>
           </w:p>
         </w:tc>
@@ -6022,14 +6525,15 @@
             <w:pPr>
               <w:jc w:val="center"/>
             </w:pPr>
-            <w:r/>
+            <w:r>
+              <w:t>Pred NOT_UP</w:t>
+            </w:r>
             <w:r>
               <w:rPr>
                 <w:rFonts w:ascii="Times New Roman" w:hAnsi="Times New Roman" w:eastAsia="Times New Roman" w:cs="Times New Roman"/>
                 <w:b/>
                 <w:sz w:val="24"/>
               </w:rPr>
-              <w:t>Pred NOT_UP</w:t>
             </w:r>
           </w:p>
         </w:tc>
@@ -6049,19 +6553,23 @@
             <w:pPr>
               <w:jc w:val="center"/>
             </w:pPr>
-            <w:r/>
+            <w:r>
+              <w:t>Pred UP</w:t>
+            </w:r>
             <w:r>
               <w:rPr>
                 <w:rFonts w:ascii="Times New Roman" w:hAnsi="Times New Roman" w:eastAsia="Times New Roman" w:cs="Times New Roman"/>
                 <w:b/>
                 <w:sz w:val="24"/>
               </w:rPr>
-              <w:t>Pred UP</w:t>
             </w:r>
           </w:p>
         </w:tc>
       </w:tr>
       <w:tr>
+        <w:trPr>
+          <w:cantSplit/>
+        </w:trPr>
         <w:tc>
           <w:tcPr>
             <w:tcW w:type="dxa" w:w="3024"/>
@@ -6077,14 +6585,15 @@
             <w:pPr>
               <w:jc w:val="center"/>
             </w:pPr>
-            <w:r/>
+            <w:r>
+              <w:t>actual_NOT_UP</w:t>
+            </w:r>
             <w:r>
               <w:rPr>
                 <w:rFonts w:ascii="Times New Roman" w:hAnsi="Times New Roman" w:eastAsia="Times New Roman" w:cs="Times New Roman"/>
                 <w:b w:val="0"/>
                 <w:sz w:val="24"/>
               </w:rPr>
-              <w:t>actual_NOT_UP</w:t>
             </w:r>
           </w:p>
         </w:tc>
@@ -6103,14 +6612,15 @@
             <w:pPr>
               <w:jc w:val="left"/>
             </w:pPr>
-            <w:r/>
+            <w:r>
+              <w:t>10440</w:t>
+            </w:r>
             <w:r>
               <w:rPr>
                 <w:rFonts w:ascii="Times New Roman" w:hAnsi="Times New Roman" w:eastAsia="Times New Roman" w:cs="Times New Roman"/>
                 <w:b w:val="0"/>
                 <w:sz w:val="24"/>
               </w:rPr>
-              <w:t>17861</w:t>
             </w:r>
           </w:p>
         </w:tc>
@@ -6129,19 +6639,23 @@
             <w:pPr>
               <w:jc w:val="left"/>
             </w:pPr>
-            <w:r/>
+            <w:r>
+              <w:t>53419</w:t>
+            </w:r>
             <w:r>
               <w:rPr>
                 <w:rFonts w:ascii="Times New Roman" w:hAnsi="Times New Roman" w:eastAsia="Times New Roman" w:cs="Times New Roman"/>
                 <w:b w:val="0"/>
                 <w:sz w:val="24"/>
               </w:rPr>
-              <w:t>10585</w:t>
             </w:r>
           </w:p>
         </w:tc>
       </w:tr>
       <w:tr>
+        <w:trPr>
+          <w:cantSplit/>
+        </w:trPr>
         <w:tc>
           <w:tcPr>
             <w:tcW w:type="dxa" w:w="3024"/>
@@ -6157,14 +6671,15 @@
             <w:pPr>
               <w:jc w:val="center"/>
             </w:pPr>
-            <w:r/>
+            <w:r>
+              <w:t>actual_UP</w:t>
+            </w:r>
             <w:r>
               <w:rPr>
                 <w:rFonts w:ascii="Times New Roman" w:hAnsi="Times New Roman" w:eastAsia="Times New Roman" w:cs="Times New Roman"/>
                 <w:b w:val="0"/>
                 <w:sz w:val="24"/>
               </w:rPr>
-              <w:t>actual_UP</w:t>
             </w:r>
           </w:p>
         </w:tc>
@@ -6183,14 +6698,15 @@
             <w:pPr>
               <w:jc w:val="left"/>
             </w:pPr>
-            <w:r/>
+            <w:r>
+              <w:t>2568</w:t>
+            </w:r>
             <w:r>
               <w:rPr>
                 <w:rFonts w:ascii="Times New Roman" w:hAnsi="Times New Roman" w:eastAsia="Times New Roman" w:cs="Times New Roman"/>
                 <w:b w:val="0"/>
                 <w:sz w:val="24"/>
               </w:rPr>
-              <w:t>6212</w:t>
             </w:r>
           </w:p>
         </w:tc>
@@ -6209,14 +6725,15 @@
             <w:pPr>
               <w:jc w:val="left"/>
             </w:pPr>
-            <w:r/>
+            <w:r>
+              <w:t>28595</w:t>
+            </w:r>
             <w:r>
               <w:rPr>
                 <w:rFonts w:ascii="Times New Roman" w:hAnsi="Times New Roman" w:eastAsia="Times New Roman" w:cs="Times New Roman"/>
                 <w:b w:val="0"/>
                 <w:sz w:val="24"/>
               </w:rPr>
-              <w:t>6574</w:t>
             </w:r>
           </w:p>
         </w:tc>
@@ -6226,11 +6743,16 @@
       <w:pPr/>
     </w:p>
     <w:p>
+      <w:pPr>
+        <w:keepNext/>
+        <w:keepLines/>
+        <w:jc w:val="center"/>
+      </w:pPr>
       <w:r>
         <w:drawing>
           <wp:inline xmlns:a="http://schemas.openxmlformats.org/drawingml/2006/main" xmlns:pic="http://schemas.openxmlformats.org/drawingml/2006/picture">
             <wp:extent cx="4389120" cy="3511296"/>
-            <wp:docPr id="4" name="Picture 4"/>
+            <wp:docPr id="8" name="Picture 8" descr="Hình 7. Ma trận nhầm lẫn của mô hình cuối" title="Hình 7. Ma trận nhầm lẫn của mô hình cuối"/>
             <wp:cNvGraphicFramePr>
               <a:graphicFrameLocks noChangeAspect="1"/>
             </wp:cNvGraphicFramePr>
@@ -6242,7 +6764,7 @@
                     <pic:cNvPicPr/>
                   </pic:nvPicPr>
                   <pic:blipFill>
-                    <a:blip r:embed="rId13"/>
+                    <a:blip r:embed="rId17"/>
                     <a:stretch>
                       <a:fillRect/>
                     </a:stretch>
@@ -6263,6 +6785,8 @@
     </w:p>
     <w:p>
       <w:pPr>
+        <w:keepNext w:val="0"/>
+        <w:keepLines/>
         <w:jc w:val="center"/>
       </w:pPr>
       <w:r>
@@ -6271,7 +6795,7 @@
           <w:i/>
           <w:sz w:val="26"/>
         </w:rPr>
-        <w:t>Hình 3. Ma trận nhầm lẫn trực quan</w:t>
+        <w:t>Hình 7. Ma trận nhầm lẫn của mô hình cuối</w:t>
       </w:r>
     </w:p>
     <w:p>
@@ -6280,11 +6804,13 @@
         <w:rPr>
           <w:rFonts w:ascii="Times New Roman" w:hAnsi="Times New Roman" w:eastAsia="Times New Roman" w:cs="Times New Roman"/>
         </w:rPr>
-        <w:t>Ma trận nhầm lẫn cho thấy mô hình dự đoán đúng 17,861 trường hợp NOT_UP và 6,574 trường hợp UP; đồng thời còn 10,585 false positive và 6,212 false negative. Kết quả này phản ánh bài toán có độ khó cao và dữ liệu mất cân bằng. Vì mục tiêu là nhận diện xu hướng tăng, Recall_UP và F1_UP được ưu tiên hơn Accuracy tổng thể.</w:t>
+        <w:t>Ma trận nhầm lẫn của Gradient Boosting gồm 10,440 true negative, 28,595 true positive, 53,419 false positive và 2,568 false negative trên 95,022 dòng TEST. Recall_UP cao 0.9176 giúp bắt phần lớn trường hợp UP, đổi lại số false positive lớn; vì vậy F1_UP và Recall_UP được phân tích cùng nhau thay vì chỉ nhìn Accuracy.</w:t>
       </w:r>
     </w:p>
     <w:p>
       <w:pPr>
+        <w:keepNext/>
+        <w:pageBreakBefore/>
         <w:jc w:val="center"/>
       </w:pPr>
       <w:r>
@@ -6308,6 +6834,10 @@
         <w:gridCol w:w="3024"/>
       </w:tblGrid>
       <w:tr>
+        <w:trPr>
+          <w:tblHeader/>
+          <w:cantSplit/>
+        </w:trPr>
         <w:tc>
           <w:tcPr>
             <w:tcW w:type="dxa" w:w="936"/>
@@ -6322,16 +6852,18 @@
           </w:tcPr>
           <w:p>
             <w:pPr>
+              <w:keepNext/>
               <w:jc w:val="center"/>
             </w:pPr>
-            <w:r/>
+            <w:r>
+              <w:t>Hạng</w:t>
+            </w:r>
             <w:r>
               <w:rPr>
                 <w:rFonts w:ascii="Times New Roman" w:hAnsi="Times New Roman" w:eastAsia="Times New Roman" w:cs="Times New Roman"/>
                 <w:b/>
                 <w:sz w:val="24"/>
               </w:rPr>
-              <w:t>Hạng</w:t>
             </w:r>
           </w:p>
         </w:tc>
@@ -6349,16 +6881,18 @@
           </w:tcPr>
           <w:p>
             <w:pPr>
+              <w:keepNext/>
               <w:jc w:val="center"/>
             </w:pPr>
-            <w:r/>
+            <w:r>
+              <w:t>Feature</w:t>
+            </w:r>
             <w:r>
               <w:rPr>
                 <w:rFonts w:ascii="Times New Roman" w:hAnsi="Times New Roman" w:eastAsia="Times New Roman" w:cs="Times New Roman"/>
                 <w:b/>
                 <w:sz w:val="24"/>
               </w:rPr>
-              <w:t>Feature</w:t>
             </w:r>
           </w:p>
         </w:tc>
@@ -6376,21 +6910,649 @@
           </w:tcPr>
           <w:p>
             <w:pPr>
+              <w:keepNext/>
               <w:jc w:val="center"/>
             </w:pPr>
-            <w:r/>
+            <w:r>
+              <w:t>Importance</w:t>
+            </w:r>
             <w:r>
               <w:rPr>
                 <w:rFonts w:ascii="Times New Roman" w:hAnsi="Times New Roman" w:eastAsia="Times New Roman" w:cs="Times New Roman"/>
                 <w:b/>
                 <w:sz w:val="24"/>
               </w:rPr>
-              <w:t>Importance</w:t>
             </w:r>
           </w:p>
         </w:tc>
       </w:tr>
       <w:tr>
+        <w:trPr>
+          <w:cantSplit/>
+        </w:trPr>
+        <w:tc>
+          <w:tcPr>
+            <w:tcW w:type="dxa" w:w="3024"/>
+            <w:vAlign w:val="center"/>
+            <w:tcMar>
+              <w:top w:w="90" w:type="dxa"/>
+              <w:start w:w="110" w:type="dxa"/>
+              <w:bottom w:w="90" w:type="dxa"/>
+              <w:end w:w="110" w:type="dxa"/>
+            </w:tcMar>
+          </w:tcPr>
+          <w:p>
+            <w:pPr>
+              <w:keepNext/>
+              <w:jc w:val="center"/>
+            </w:pPr>
+            <w:r>
+              <w:t>1</w:t>
+            </w:r>
+            <w:r>
+              <w:rPr>
+                <w:rFonts w:ascii="Times New Roman" w:hAnsi="Times New Roman" w:eastAsia="Times New Roman" w:cs="Times New Roman"/>
+                <w:b w:val="0"/>
+                <w:sz w:val="24"/>
+              </w:rPr>
+            </w:r>
+          </w:p>
+        </w:tc>
+        <w:tc>
+          <w:tcPr>
+            <w:tcW w:type="dxa" w:w="3024"/>
+            <w:vAlign w:val="center"/>
+            <w:tcMar>
+              <w:top w:w="90" w:type="dxa"/>
+              <w:start w:w="110" w:type="dxa"/>
+              <w:bottom w:w="90" w:type="dxa"/>
+              <w:end w:w="110" w:type="dxa"/>
+            </w:tcMar>
+          </w:tcPr>
+          <w:p>
+            <w:pPr>
+              <w:keepNext/>
+              <w:jc w:val="left"/>
+            </w:pPr>
+            <w:r>
+              <w:t>volatility_20d</w:t>
+            </w:r>
+            <w:r>
+              <w:rPr>
+                <w:rFonts w:ascii="Times New Roman" w:hAnsi="Times New Roman" w:eastAsia="Times New Roman" w:cs="Times New Roman"/>
+                <w:b w:val="0"/>
+                <w:sz w:val="24"/>
+              </w:rPr>
+            </w:r>
+          </w:p>
+        </w:tc>
+        <w:tc>
+          <w:tcPr>
+            <w:tcW w:type="dxa" w:w="3024"/>
+            <w:vAlign w:val="center"/>
+            <w:tcMar>
+              <w:top w:w="90" w:type="dxa"/>
+              <w:start w:w="110" w:type="dxa"/>
+              <w:bottom w:w="90" w:type="dxa"/>
+              <w:end w:w="110" w:type="dxa"/>
+            </w:tcMar>
+          </w:tcPr>
+          <w:p>
+            <w:pPr>
+              <w:keepNext/>
+              <w:jc w:val="left"/>
+            </w:pPr>
+            <w:r>
+              <w:t>0.4236</w:t>
+            </w:r>
+            <w:r>
+              <w:rPr>
+                <w:rFonts w:ascii="Times New Roman" w:hAnsi="Times New Roman" w:eastAsia="Times New Roman" w:cs="Times New Roman"/>
+                <w:b w:val="0"/>
+                <w:sz w:val="24"/>
+              </w:rPr>
+            </w:r>
+          </w:p>
+        </w:tc>
+      </w:tr>
+      <w:tr>
+        <w:trPr>
+          <w:cantSplit/>
+        </w:trPr>
+        <w:tc>
+          <w:tcPr>
+            <w:tcW w:type="dxa" w:w="3024"/>
+            <w:vAlign w:val="center"/>
+            <w:tcMar>
+              <w:top w:w="90" w:type="dxa"/>
+              <w:start w:w="110" w:type="dxa"/>
+              <w:bottom w:w="90" w:type="dxa"/>
+              <w:end w:w="110" w:type="dxa"/>
+            </w:tcMar>
+          </w:tcPr>
+          <w:p>
+            <w:pPr>
+              <w:keepNext/>
+              <w:jc w:val="center"/>
+            </w:pPr>
+            <w:r>
+              <w:t>2</w:t>
+            </w:r>
+            <w:r>
+              <w:rPr>
+                <w:rFonts w:ascii="Times New Roman" w:hAnsi="Times New Roman" w:eastAsia="Times New Roman" w:cs="Times New Roman"/>
+                <w:b w:val="0"/>
+                <w:sz w:val="24"/>
+              </w:rPr>
+            </w:r>
+          </w:p>
+        </w:tc>
+        <w:tc>
+          <w:tcPr>
+            <w:tcW w:type="dxa" w:w="3024"/>
+            <w:vAlign w:val="center"/>
+            <w:tcMar>
+              <w:top w:w="90" w:type="dxa"/>
+              <w:start w:w="110" w:type="dxa"/>
+              <w:bottom w:w="90" w:type="dxa"/>
+              <w:end w:w="110" w:type="dxa"/>
+            </w:tcMar>
+          </w:tcPr>
+          <w:p>
+            <w:pPr>
+              <w:keepNext/>
+              <w:jc w:val="left"/>
+            </w:pPr>
+            <w:r>
+              <w:t>month</w:t>
+            </w:r>
+            <w:r>
+              <w:rPr>
+                <w:rFonts w:ascii="Times New Roman" w:hAnsi="Times New Roman" w:eastAsia="Times New Roman" w:cs="Times New Roman"/>
+                <w:b w:val="0"/>
+                <w:sz w:val="24"/>
+              </w:rPr>
+            </w:r>
+          </w:p>
+        </w:tc>
+        <w:tc>
+          <w:tcPr>
+            <w:tcW w:type="dxa" w:w="3024"/>
+            <w:vAlign w:val="center"/>
+            <w:tcMar>
+              <w:top w:w="90" w:type="dxa"/>
+              <w:start w:w="110" w:type="dxa"/>
+              <w:bottom w:w="90" w:type="dxa"/>
+              <w:end w:w="110" w:type="dxa"/>
+            </w:tcMar>
+          </w:tcPr>
+          <w:p>
+            <w:pPr>
+              <w:keepNext/>
+              <w:jc w:val="left"/>
+            </w:pPr>
+            <w:r>
+              <w:t>0.1796</w:t>
+            </w:r>
+            <w:r>
+              <w:rPr>
+                <w:rFonts w:ascii="Times New Roman" w:hAnsi="Times New Roman" w:eastAsia="Times New Roman" w:cs="Times New Roman"/>
+                <w:b w:val="0"/>
+                <w:sz w:val="24"/>
+              </w:rPr>
+            </w:r>
+          </w:p>
+        </w:tc>
+      </w:tr>
+      <w:tr>
+        <w:trPr>
+          <w:cantSplit/>
+        </w:trPr>
+        <w:tc>
+          <w:tcPr>
+            <w:tcW w:type="dxa" w:w="3024"/>
+            <w:vAlign w:val="center"/>
+            <w:tcMar>
+              <w:top w:w="90" w:type="dxa"/>
+              <w:start w:w="110" w:type="dxa"/>
+              <w:bottom w:w="90" w:type="dxa"/>
+              <w:end w:w="110" w:type="dxa"/>
+            </w:tcMar>
+          </w:tcPr>
+          <w:p>
+            <w:pPr>
+              <w:keepNext/>
+              <w:jc w:val="center"/>
+            </w:pPr>
+            <w:r>
+              <w:t>3</w:t>
+            </w:r>
+            <w:r>
+              <w:rPr>
+                <w:rFonts w:ascii="Times New Roman" w:hAnsi="Times New Roman" w:eastAsia="Times New Roman" w:cs="Times New Roman"/>
+                <w:b w:val="0"/>
+                <w:sz w:val="24"/>
+              </w:rPr>
+            </w:r>
+          </w:p>
+        </w:tc>
+        <w:tc>
+          <w:tcPr>
+            <w:tcW w:type="dxa" w:w="3024"/>
+            <w:vAlign w:val="center"/>
+            <w:tcMar>
+              <w:top w:w="90" w:type="dxa"/>
+              <w:start w:w="110" w:type="dxa"/>
+              <w:bottom w:w="90" w:type="dxa"/>
+              <w:end w:w="110" w:type="dxa"/>
+            </w:tcMar>
+          </w:tcPr>
+          <w:p>
+            <w:pPr>
+              <w:keepNext/>
+              <w:jc w:val="left"/>
+            </w:pPr>
+            <w:r>
+              <w:t>return_20d</w:t>
+            </w:r>
+            <w:r>
+              <w:rPr>
+                <w:rFonts w:ascii="Times New Roman" w:hAnsi="Times New Roman" w:eastAsia="Times New Roman" w:cs="Times New Roman"/>
+                <w:b w:val="0"/>
+                <w:sz w:val="24"/>
+              </w:rPr>
+            </w:r>
+          </w:p>
+        </w:tc>
+        <w:tc>
+          <w:tcPr>
+            <w:tcW w:type="dxa" w:w="3024"/>
+            <w:vAlign w:val="center"/>
+            <w:tcMar>
+              <w:top w:w="90" w:type="dxa"/>
+              <w:start w:w="110" w:type="dxa"/>
+              <w:bottom w:w="90" w:type="dxa"/>
+              <w:end w:w="110" w:type="dxa"/>
+            </w:tcMar>
+          </w:tcPr>
+          <w:p>
+            <w:pPr>
+              <w:keepNext/>
+              <w:jc w:val="left"/>
+            </w:pPr>
+            <w:r>
+              <w:t>0.0763</w:t>
+            </w:r>
+            <w:r>
+              <w:rPr>
+                <w:rFonts w:ascii="Times New Roman" w:hAnsi="Times New Roman" w:eastAsia="Times New Roman" w:cs="Times New Roman"/>
+                <w:b w:val="0"/>
+                <w:sz w:val="24"/>
+              </w:rPr>
+            </w:r>
+          </w:p>
+        </w:tc>
+      </w:tr>
+      <w:tr>
+        <w:trPr>
+          <w:cantSplit/>
+        </w:trPr>
+        <w:tc>
+          <w:tcPr>
+            <w:tcW w:type="dxa" w:w="3024"/>
+            <w:vAlign w:val="center"/>
+            <w:tcMar>
+              <w:top w:w="90" w:type="dxa"/>
+              <w:start w:w="110" w:type="dxa"/>
+              <w:bottom w:w="90" w:type="dxa"/>
+              <w:end w:w="110" w:type="dxa"/>
+            </w:tcMar>
+          </w:tcPr>
+          <w:p>
+            <w:pPr>
+              <w:keepNext/>
+              <w:jc w:val="center"/>
+            </w:pPr>
+            <w:r>
+              <w:t>4</w:t>
+            </w:r>
+            <w:r>
+              <w:rPr>
+                <w:rFonts w:ascii="Times New Roman" w:hAnsi="Times New Roman" w:eastAsia="Times New Roman" w:cs="Times New Roman"/>
+                <w:b w:val="0"/>
+                <w:sz w:val="24"/>
+              </w:rPr>
+            </w:r>
+          </w:p>
+        </w:tc>
+        <w:tc>
+          <w:tcPr>
+            <w:tcW w:type="dxa" w:w="3024"/>
+            <w:vAlign w:val="center"/>
+            <w:tcMar>
+              <w:top w:w="90" w:type="dxa"/>
+              <w:start w:w="110" w:type="dxa"/>
+              <w:bottom w:w="90" w:type="dxa"/>
+              <w:end w:w="110" w:type="dxa"/>
+            </w:tcMar>
+          </w:tcPr>
+          <w:p>
+            <w:pPr>
+              <w:keepNext/>
+              <w:jc w:val="left"/>
+            </w:pPr>
+            <w:r>
+              <w:t>return_1d</w:t>
+            </w:r>
+            <w:r>
+              <w:rPr>
+                <w:rFonts w:ascii="Times New Roman" w:hAnsi="Times New Roman" w:eastAsia="Times New Roman" w:cs="Times New Roman"/>
+                <w:b w:val="0"/>
+                <w:sz w:val="24"/>
+              </w:rPr>
+            </w:r>
+          </w:p>
+        </w:tc>
+        <w:tc>
+          <w:tcPr>
+            <w:tcW w:type="dxa" w:w="3024"/>
+            <w:vAlign w:val="center"/>
+            <w:tcMar>
+              <w:top w:w="90" w:type="dxa"/>
+              <w:start w:w="110" w:type="dxa"/>
+              <w:bottom w:w="90" w:type="dxa"/>
+              <w:end w:w="110" w:type="dxa"/>
+            </w:tcMar>
+          </w:tcPr>
+          <w:p>
+            <w:pPr>
+              <w:keepNext/>
+              <w:jc w:val="left"/>
+            </w:pPr>
+            <w:r>
+              <w:t>0.0713</w:t>
+            </w:r>
+            <w:r>
+              <w:rPr>
+                <w:rFonts w:ascii="Times New Roman" w:hAnsi="Times New Roman" w:eastAsia="Times New Roman" w:cs="Times New Roman"/>
+                <w:b w:val="0"/>
+                <w:sz w:val="24"/>
+              </w:rPr>
+            </w:r>
+          </w:p>
+        </w:tc>
+      </w:tr>
+      <w:tr>
+        <w:trPr>
+          <w:cantSplit/>
+        </w:trPr>
+        <w:tc>
+          <w:tcPr>
+            <w:tcW w:type="dxa" w:w="3024"/>
+            <w:vAlign w:val="center"/>
+            <w:tcMar>
+              <w:top w:w="90" w:type="dxa"/>
+              <w:start w:w="110" w:type="dxa"/>
+              <w:bottom w:w="90" w:type="dxa"/>
+              <w:end w:w="110" w:type="dxa"/>
+            </w:tcMar>
+          </w:tcPr>
+          <w:p>
+            <w:pPr>
+              <w:keepNext/>
+              <w:jc w:val="center"/>
+            </w:pPr>
+            <w:r>
+              <w:t>5</w:t>
+            </w:r>
+            <w:r>
+              <w:rPr>
+                <w:rFonts w:ascii="Times New Roman" w:hAnsi="Times New Roman" w:eastAsia="Times New Roman" w:cs="Times New Roman"/>
+                <w:b w:val="0"/>
+                <w:sz w:val="24"/>
+              </w:rPr>
+            </w:r>
+          </w:p>
+        </w:tc>
+        <w:tc>
+          <w:tcPr>
+            <w:tcW w:type="dxa" w:w="3024"/>
+            <w:vAlign w:val="center"/>
+            <w:tcMar>
+              <w:top w:w="90" w:type="dxa"/>
+              <w:start w:w="110" w:type="dxa"/>
+              <w:bottom w:w="90" w:type="dxa"/>
+              <w:end w:w="110" w:type="dxa"/>
+            </w:tcMar>
+          </w:tcPr>
+          <w:p>
+            <w:pPr>
+              <w:keepNext/>
+              <w:jc w:val="left"/>
+            </w:pPr>
+            <w:r>
+              <w:t>volume_ratio_20</w:t>
+            </w:r>
+            <w:r>
+              <w:rPr>
+                <w:rFonts w:ascii="Times New Roman" w:hAnsi="Times New Roman" w:eastAsia="Times New Roman" w:cs="Times New Roman"/>
+                <w:b w:val="0"/>
+                <w:sz w:val="24"/>
+              </w:rPr>
+            </w:r>
+          </w:p>
+        </w:tc>
+        <w:tc>
+          <w:tcPr>
+            <w:tcW w:type="dxa" w:w="3024"/>
+            <w:vAlign w:val="center"/>
+            <w:tcMar>
+              <w:top w:w="90" w:type="dxa"/>
+              <w:start w:w="110" w:type="dxa"/>
+              <w:bottom w:w="90" w:type="dxa"/>
+              <w:end w:w="110" w:type="dxa"/>
+            </w:tcMar>
+          </w:tcPr>
+          <w:p>
+            <w:pPr>
+              <w:keepNext/>
+              <w:jc w:val="left"/>
+            </w:pPr>
+            <w:r>
+              <w:t>0.0561</w:t>
+            </w:r>
+            <w:r>
+              <w:rPr>
+                <w:rFonts w:ascii="Times New Roman" w:hAnsi="Times New Roman" w:eastAsia="Times New Roman" w:cs="Times New Roman"/>
+                <w:b w:val="0"/>
+                <w:sz w:val="24"/>
+              </w:rPr>
+            </w:r>
+          </w:p>
+        </w:tc>
+      </w:tr>
+      <w:tr>
+        <w:trPr>
+          <w:cantSplit/>
+        </w:trPr>
+        <w:tc>
+          <w:tcPr>
+            <w:tcW w:type="dxa" w:w="3024"/>
+            <w:vAlign w:val="center"/>
+            <w:tcMar>
+              <w:top w:w="90" w:type="dxa"/>
+              <w:start w:w="110" w:type="dxa"/>
+              <w:bottom w:w="90" w:type="dxa"/>
+              <w:end w:w="110" w:type="dxa"/>
+            </w:tcMar>
+          </w:tcPr>
+          <w:p>
+            <w:pPr>
+              <w:keepNext/>
+              <w:jc w:val="center"/>
+            </w:pPr>
+            <w:r>
+              <w:t>6</w:t>
+            </w:r>
+            <w:r>
+              <w:rPr>
+                <w:rFonts w:ascii="Times New Roman" w:hAnsi="Times New Roman" w:eastAsia="Times New Roman" w:cs="Times New Roman"/>
+                <w:b w:val="0"/>
+                <w:sz w:val="24"/>
+              </w:rPr>
+            </w:r>
+          </w:p>
+        </w:tc>
+        <w:tc>
+          <w:tcPr>
+            <w:tcW w:type="dxa" w:w="3024"/>
+            <w:vAlign w:val="center"/>
+            <w:tcMar>
+              <w:top w:w="90" w:type="dxa"/>
+              <w:start w:w="110" w:type="dxa"/>
+              <w:bottom w:w="90" w:type="dxa"/>
+              <w:end w:w="110" w:type="dxa"/>
+            </w:tcMar>
+          </w:tcPr>
+          <w:p>
+            <w:pPr>
+              <w:keepNext/>
+              <w:jc w:val="left"/>
+            </w:pPr>
+            <w:r>
+              <w:t>return_3d</w:t>
+            </w:r>
+            <w:r>
+              <w:rPr>
+                <w:rFonts w:ascii="Times New Roman" w:hAnsi="Times New Roman" w:eastAsia="Times New Roman" w:cs="Times New Roman"/>
+                <w:b w:val="0"/>
+                <w:sz w:val="24"/>
+              </w:rPr>
+            </w:r>
+          </w:p>
+        </w:tc>
+        <w:tc>
+          <w:tcPr>
+            <w:tcW w:type="dxa" w:w="3024"/>
+            <w:vAlign w:val="center"/>
+            <w:tcMar>
+              <w:top w:w="90" w:type="dxa"/>
+              <w:start w:w="110" w:type="dxa"/>
+              <w:bottom w:w="90" w:type="dxa"/>
+              <w:end w:w="110" w:type="dxa"/>
+            </w:tcMar>
+          </w:tcPr>
+          <w:p>
+            <w:pPr>
+              <w:keepNext/>
+              <w:jc w:val="left"/>
+            </w:pPr>
+            <w:r>
+              <w:t>0.0493</w:t>
+            </w:r>
+            <w:r>
+              <w:rPr>
+                <w:rFonts w:ascii="Times New Roman" w:hAnsi="Times New Roman" w:eastAsia="Times New Roman" w:cs="Times New Roman"/>
+                <w:b w:val="0"/>
+                <w:sz w:val="24"/>
+              </w:rPr>
+            </w:r>
+          </w:p>
+        </w:tc>
+      </w:tr>
+      <w:tr>
+        <w:trPr>
+          <w:cantSplit/>
+        </w:trPr>
+        <w:tc>
+          <w:tcPr>
+            <w:tcW w:type="dxa" w:w="3024"/>
+            <w:vAlign w:val="center"/>
+            <w:tcMar>
+              <w:top w:w="90" w:type="dxa"/>
+              <w:start w:w="110" w:type="dxa"/>
+              <w:bottom w:w="90" w:type="dxa"/>
+              <w:end w:w="110" w:type="dxa"/>
+            </w:tcMar>
+          </w:tcPr>
+          <w:p>
+            <w:pPr>
+              <w:keepNext/>
+              <w:jc w:val="center"/>
+            </w:pPr>
+            <w:r>
+              <w:t>7</w:t>
+            </w:r>
+            <w:r>
+              <w:rPr>
+                <w:rFonts w:ascii="Times New Roman" w:hAnsi="Times New Roman" w:eastAsia="Times New Roman" w:cs="Times New Roman"/>
+                <w:b w:val="0"/>
+                <w:sz w:val="24"/>
+              </w:rPr>
+            </w:r>
+          </w:p>
+        </w:tc>
+        <w:tc>
+          <w:tcPr>
+            <w:tcW w:type="dxa" w:w="3024"/>
+            <w:vAlign w:val="center"/>
+            <w:tcMar>
+              <w:top w:w="90" w:type="dxa"/>
+              <w:start w:w="110" w:type="dxa"/>
+              <w:bottom w:w="90" w:type="dxa"/>
+              <w:end w:w="110" w:type="dxa"/>
+            </w:tcMar>
+          </w:tcPr>
+          <w:p>
+            <w:pPr>
+              <w:keepNext/>
+              <w:jc w:val="left"/>
+            </w:pPr>
+            <w:r>
+              <w:t>volume_change_1d</w:t>
+            </w:r>
+            <w:r>
+              <w:rPr>
+                <w:rFonts w:ascii="Times New Roman" w:hAnsi="Times New Roman" w:eastAsia="Times New Roman" w:cs="Times New Roman"/>
+                <w:b w:val="0"/>
+                <w:sz w:val="24"/>
+              </w:rPr>
+            </w:r>
+          </w:p>
+        </w:tc>
+        <w:tc>
+          <w:tcPr>
+            <w:tcW w:type="dxa" w:w="3024"/>
+            <w:vAlign w:val="center"/>
+            <w:tcMar>
+              <w:top w:w="90" w:type="dxa"/>
+              <w:start w:w="110" w:type="dxa"/>
+              <w:bottom w:w="90" w:type="dxa"/>
+              <w:end w:w="110" w:type="dxa"/>
+            </w:tcMar>
+          </w:tcPr>
+          <w:p>
+            <w:pPr>
+              <w:keepNext/>
+              <w:jc w:val="left"/>
+            </w:pPr>
+            <w:r>
+              <w:t>0.0323</w:t>
+            </w:r>
+            <w:r>
+              <w:rPr>
+                <w:rFonts w:ascii="Times New Roman" w:hAnsi="Times New Roman" w:eastAsia="Times New Roman" w:cs="Times New Roman"/>
+                <w:b w:val="0"/>
+                <w:sz w:val="24"/>
+              </w:rPr>
+            </w:r>
+          </w:p>
+        </w:tc>
+      </w:tr>
+      <w:tr>
+        <w:trPr>
+          <w:cantSplit/>
+        </w:trPr>
         <w:tc>
           <w:tcPr>
             <w:tcW w:type="dxa" w:w="3024"/>
@@ -6406,14 +7568,15 @@
             <w:pPr>
               <w:jc w:val="center"/>
             </w:pPr>
-            <w:r/>
+            <w:r>
+              <w:t>8</w:t>
+            </w:r>
             <w:r>
               <w:rPr>
                 <w:rFonts w:ascii="Times New Roman" w:hAnsi="Times New Roman" w:eastAsia="Times New Roman" w:cs="Times New Roman"/>
                 <w:b w:val="0"/>
                 <w:sz w:val="24"/>
               </w:rPr>
-              <w:t>1</w:t>
             </w:r>
           </w:p>
         </w:tc>
@@ -6432,14 +7595,15 @@
             <w:pPr>
               <w:jc w:val="left"/>
             </w:pPr>
-            <w:r/>
+            <w:r>
+              <w:t>close_open_return</w:t>
+            </w:r>
             <w:r>
               <w:rPr>
                 <w:rFonts w:ascii="Times New Roman" w:hAnsi="Times New Roman" w:eastAsia="Times New Roman" w:cs="Times New Roman"/>
                 <w:b w:val="0"/>
                 <w:sz w:val="24"/>
               </w:rPr>
-              <w:t>volatility_20d</w:t>
             </w:r>
           </w:p>
         </w:tc>
@@ -6458,574 +7622,15 @@
             <w:pPr>
               <w:jc w:val="left"/>
             </w:pPr>
-            <w:r/>
+            <w:r>
+              <w:t>0.0257</w:t>
+            </w:r>
             <w:r>
               <w:rPr>
                 <w:rFonts w:ascii="Times New Roman" w:hAnsi="Times New Roman" w:eastAsia="Times New Roman" w:cs="Times New Roman"/>
                 <w:b w:val="0"/>
                 <w:sz w:val="24"/>
               </w:rPr>
-              <w:t>0.3115</w:t>
-            </w:r>
-          </w:p>
-        </w:tc>
-      </w:tr>
-      <w:tr>
-        <w:tc>
-          <w:tcPr>
-            <w:tcW w:type="dxa" w:w="3024"/>
-            <w:vAlign w:val="center"/>
-            <w:tcMar>
-              <w:top w:w="90" w:type="dxa"/>
-              <w:start w:w="110" w:type="dxa"/>
-              <w:bottom w:w="90" w:type="dxa"/>
-              <w:end w:w="110" w:type="dxa"/>
-            </w:tcMar>
-          </w:tcPr>
-          <w:p>
-            <w:pPr>
-              <w:jc w:val="center"/>
-            </w:pPr>
-            <w:r/>
-            <w:r>
-              <w:rPr>
-                <w:rFonts w:ascii="Times New Roman" w:hAnsi="Times New Roman" w:eastAsia="Times New Roman" w:cs="Times New Roman"/>
-                <w:b w:val="0"/>
-                <w:sz w:val="24"/>
-              </w:rPr>
-              <w:t>2</w:t>
-            </w:r>
-          </w:p>
-        </w:tc>
-        <w:tc>
-          <w:tcPr>
-            <w:tcW w:type="dxa" w:w="3024"/>
-            <w:vAlign w:val="center"/>
-            <w:tcMar>
-              <w:top w:w="90" w:type="dxa"/>
-              <w:start w:w="110" w:type="dxa"/>
-              <w:bottom w:w="90" w:type="dxa"/>
-              <w:end w:w="110" w:type="dxa"/>
-            </w:tcMar>
-          </w:tcPr>
-          <w:p>
-            <w:pPr>
-              <w:jc w:val="left"/>
-            </w:pPr>
-            <w:r/>
-            <w:r>
-              <w:rPr>
-                <w:rFonts w:ascii="Times New Roman" w:hAnsi="Times New Roman" w:eastAsia="Times New Roman" w:cs="Times New Roman"/>
-                <w:b w:val="0"/>
-                <w:sz w:val="24"/>
-              </w:rPr>
-              <w:t>return_1d</w:t>
-            </w:r>
-          </w:p>
-        </w:tc>
-        <w:tc>
-          <w:tcPr>
-            <w:tcW w:type="dxa" w:w="3024"/>
-            <w:vAlign w:val="center"/>
-            <w:tcMar>
-              <w:top w:w="90" w:type="dxa"/>
-              <w:start w:w="110" w:type="dxa"/>
-              <w:bottom w:w="90" w:type="dxa"/>
-              <w:end w:w="110" w:type="dxa"/>
-            </w:tcMar>
-          </w:tcPr>
-          <w:p>
-            <w:pPr>
-              <w:jc w:val="left"/>
-            </w:pPr>
-            <w:r/>
-            <w:r>
-              <w:rPr>
-                <w:rFonts w:ascii="Times New Roman" w:hAnsi="Times New Roman" w:eastAsia="Times New Roman" w:cs="Times New Roman"/>
-                <w:b w:val="0"/>
-                <w:sz w:val="24"/>
-              </w:rPr>
-              <w:t>0.0892</w:t>
-            </w:r>
-          </w:p>
-        </w:tc>
-      </w:tr>
-      <w:tr>
-        <w:tc>
-          <w:tcPr>
-            <w:tcW w:type="dxa" w:w="3024"/>
-            <w:vAlign w:val="center"/>
-            <w:tcMar>
-              <w:top w:w="90" w:type="dxa"/>
-              <w:start w:w="110" w:type="dxa"/>
-              <w:bottom w:w="90" w:type="dxa"/>
-              <w:end w:w="110" w:type="dxa"/>
-            </w:tcMar>
-          </w:tcPr>
-          <w:p>
-            <w:pPr>
-              <w:jc w:val="center"/>
-            </w:pPr>
-            <w:r/>
-            <w:r>
-              <w:rPr>
-                <w:rFonts w:ascii="Times New Roman" w:hAnsi="Times New Roman" w:eastAsia="Times New Roman" w:cs="Times New Roman"/>
-                <w:b w:val="0"/>
-                <w:sz w:val="24"/>
-              </w:rPr>
-              <w:t>3</w:t>
-            </w:r>
-          </w:p>
-        </w:tc>
-        <w:tc>
-          <w:tcPr>
-            <w:tcW w:type="dxa" w:w="3024"/>
-            <w:vAlign w:val="center"/>
-            <w:tcMar>
-              <w:top w:w="90" w:type="dxa"/>
-              <w:start w:w="110" w:type="dxa"/>
-              <w:bottom w:w="90" w:type="dxa"/>
-              <w:end w:w="110" w:type="dxa"/>
-            </w:tcMar>
-          </w:tcPr>
-          <w:p>
-            <w:pPr>
-              <w:jc w:val="left"/>
-            </w:pPr>
-            <w:r/>
-            <w:r>
-              <w:rPr>
-                <w:rFonts w:ascii="Times New Roman" w:hAnsi="Times New Roman" w:eastAsia="Times New Roman" w:cs="Times New Roman"/>
-                <w:b w:val="0"/>
-                <w:sz w:val="24"/>
-              </w:rPr>
-              <w:t>volatility_5d</w:t>
-            </w:r>
-          </w:p>
-        </w:tc>
-        <w:tc>
-          <w:tcPr>
-            <w:tcW w:type="dxa" w:w="3024"/>
-            <w:vAlign w:val="center"/>
-            <w:tcMar>
-              <w:top w:w="90" w:type="dxa"/>
-              <w:start w:w="110" w:type="dxa"/>
-              <w:bottom w:w="90" w:type="dxa"/>
-              <w:end w:w="110" w:type="dxa"/>
-            </w:tcMar>
-          </w:tcPr>
-          <w:p>
-            <w:pPr>
-              <w:jc w:val="left"/>
-            </w:pPr>
-            <w:r/>
-            <w:r>
-              <w:rPr>
-                <w:rFonts w:ascii="Times New Roman" w:hAnsi="Times New Roman" w:eastAsia="Times New Roman" w:cs="Times New Roman"/>
-                <w:b w:val="0"/>
-                <w:sz w:val="24"/>
-              </w:rPr>
-              <w:t>0.0845</w:t>
-            </w:r>
-          </w:p>
-        </w:tc>
-      </w:tr>
-      <w:tr>
-        <w:tc>
-          <w:tcPr>
-            <w:tcW w:type="dxa" w:w="3024"/>
-            <w:vAlign w:val="center"/>
-            <w:tcMar>
-              <w:top w:w="90" w:type="dxa"/>
-              <w:start w:w="110" w:type="dxa"/>
-              <w:bottom w:w="90" w:type="dxa"/>
-              <w:end w:w="110" w:type="dxa"/>
-            </w:tcMar>
-          </w:tcPr>
-          <w:p>
-            <w:pPr>
-              <w:jc w:val="center"/>
-            </w:pPr>
-            <w:r/>
-            <w:r>
-              <w:rPr>
-                <w:rFonts w:ascii="Times New Roman" w:hAnsi="Times New Roman" w:eastAsia="Times New Roman" w:cs="Times New Roman"/>
-                <w:b w:val="0"/>
-                <w:sz w:val="24"/>
-              </w:rPr>
-              <w:t>4</w:t>
-            </w:r>
-          </w:p>
-        </w:tc>
-        <w:tc>
-          <w:tcPr>
-            <w:tcW w:type="dxa" w:w="3024"/>
-            <w:vAlign w:val="center"/>
-            <w:tcMar>
-              <w:top w:w="90" w:type="dxa"/>
-              <w:start w:w="110" w:type="dxa"/>
-              <w:bottom w:w="90" w:type="dxa"/>
-              <w:end w:w="110" w:type="dxa"/>
-            </w:tcMar>
-          </w:tcPr>
-          <w:p>
-            <w:pPr>
-              <w:jc w:val="left"/>
-            </w:pPr>
-            <w:r/>
-            <w:r>
-              <w:rPr>
-                <w:rFonts w:ascii="Times New Roman" w:hAnsi="Times New Roman" w:eastAsia="Times New Roman" w:cs="Times New Roman"/>
-                <w:b w:val="0"/>
-                <w:sz w:val="24"/>
-              </w:rPr>
-              <w:t>close_vs_sma20</w:t>
-            </w:r>
-          </w:p>
-        </w:tc>
-        <w:tc>
-          <w:tcPr>
-            <w:tcW w:type="dxa" w:w="3024"/>
-            <w:vAlign w:val="center"/>
-            <w:tcMar>
-              <w:top w:w="90" w:type="dxa"/>
-              <w:start w:w="110" w:type="dxa"/>
-              <w:bottom w:w="90" w:type="dxa"/>
-              <w:end w:w="110" w:type="dxa"/>
-            </w:tcMar>
-          </w:tcPr>
-          <w:p>
-            <w:pPr>
-              <w:jc w:val="left"/>
-            </w:pPr>
-            <w:r/>
-            <w:r>
-              <w:rPr>
-                <w:rFonts w:ascii="Times New Roman" w:hAnsi="Times New Roman" w:eastAsia="Times New Roman" w:cs="Times New Roman"/>
-                <w:b w:val="0"/>
-                <w:sz w:val="24"/>
-              </w:rPr>
-              <w:t>0.0824</w:t>
-            </w:r>
-          </w:p>
-        </w:tc>
-      </w:tr>
-      <w:tr>
-        <w:tc>
-          <w:tcPr>
-            <w:tcW w:type="dxa" w:w="3024"/>
-            <w:vAlign w:val="center"/>
-            <w:tcMar>
-              <w:top w:w="90" w:type="dxa"/>
-              <w:start w:w="110" w:type="dxa"/>
-              <w:bottom w:w="90" w:type="dxa"/>
-              <w:end w:w="110" w:type="dxa"/>
-            </w:tcMar>
-          </w:tcPr>
-          <w:p>
-            <w:pPr>
-              <w:jc w:val="center"/>
-            </w:pPr>
-            <w:r/>
-            <w:r>
-              <w:rPr>
-                <w:rFonts w:ascii="Times New Roman" w:hAnsi="Times New Roman" w:eastAsia="Times New Roman" w:cs="Times New Roman"/>
-                <w:b w:val="0"/>
-                <w:sz w:val="24"/>
-              </w:rPr>
-              <w:t>5</w:t>
-            </w:r>
-          </w:p>
-        </w:tc>
-        <w:tc>
-          <w:tcPr>
-            <w:tcW w:type="dxa" w:w="3024"/>
-            <w:vAlign w:val="center"/>
-            <w:tcMar>
-              <w:top w:w="90" w:type="dxa"/>
-              <w:start w:w="110" w:type="dxa"/>
-              <w:bottom w:w="90" w:type="dxa"/>
-              <w:end w:w="110" w:type="dxa"/>
-            </w:tcMar>
-          </w:tcPr>
-          <w:p>
-            <w:pPr>
-              <w:jc w:val="left"/>
-            </w:pPr>
-            <w:r/>
-            <w:r>
-              <w:rPr>
-                <w:rFonts w:ascii="Times New Roman" w:hAnsi="Times New Roman" w:eastAsia="Times New Roman" w:cs="Times New Roman"/>
-                <w:b w:val="0"/>
-                <w:sz w:val="24"/>
-              </w:rPr>
-              <w:t>return_3d</w:t>
-            </w:r>
-          </w:p>
-        </w:tc>
-        <w:tc>
-          <w:tcPr>
-            <w:tcW w:type="dxa" w:w="3024"/>
-            <w:vAlign w:val="center"/>
-            <w:tcMar>
-              <w:top w:w="90" w:type="dxa"/>
-              <w:start w:w="110" w:type="dxa"/>
-              <w:bottom w:w="90" w:type="dxa"/>
-              <w:end w:w="110" w:type="dxa"/>
-            </w:tcMar>
-          </w:tcPr>
-          <w:p>
-            <w:pPr>
-              <w:jc w:val="left"/>
-            </w:pPr>
-            <w:r/>
-            <w:r>
-              <w:rPr>
-                <w:rFonts w:ascii="Times New Roman" w:hAnsi="Times New Roman" w:eastAsia="Times New Roman" w:cs="Times New Roman"/>
-                <w:b w:val="0"/>
-                <w:sz w:val="24"/>
-              </w:rPr>
-              <w:t>0.0735</w:t>
-            </w:r>
-          </w:p>
-        </w:tc>
-      </w:tr>
-      <w:tr>
-        <w:tc>
-          <w:tcPr>
-            <w:tcW w:type="dxa" w:w="3024"/>
-            <w:vAlign w:val="center"/>
-            <w:tcMar>
-              <w:top w:w="90" w:type="dxa"/>
-              <w:start w:w="110" w:type="dxa"/>
-              <w:bottom w:w="90" w:type="dxa"/>
-              <w:end w:w="110" w:type="dxa"/>
-            </w:tcMar>
-          </w:tcPr>
-          <w:p>
-            <w:pPr>
-              <w:jc w:val="center"/>
-            </w:pPr>
-            <w:r/>
-            <w:r>
-              <w:rPr>
-                <w:rFonts w:ascii="Times New Roman" w:hAnsi="Times New Roman" w:eastAsia="Times New Roman" w:cs="Times New Roman"/>
-                <w:b w:val="0"/>
-                <w:sz w:val="24"/>
-              </w:rPr>
-              <w:t>6</w:t>
-            </w:r>
-          </w:p>
-        </w:tc>
-        <w:tc>
-          <w:tcPr>
-            <w:tcW w:type="dxa" w:w="3024"/>
-            <w:vAlign w:val="center"/>
-            <w:tcMar>
-              <w:top w:w="90" w:type="dxa"/>
-              <w:start w:w="110" w:type="dxa"/>
-              <w:bottom w:w="90" w:type="dxa"/>
-              <w:end w:w="110" w:type="dxa"/>
-            </w:tcMar>
-          </w:tcPr>
-          <w:p>
-            <w:pPr>
-              <w:jc w:val="left"/>
-            </w:pPr>
-            <w:r/>
-            <w:r>
-              <w:rPr>
-                <w:rFonts w:ascii="Times New Roman" w:hAnsi="Times New Roman" w:eastAsia="Times New Roman" w:cs="Times New Roman"/>
-                <w:b w:val="0"/>
-                <w:sz w:val="24"/>
-              </w:rPr>
-              <w:t>volume_ratio_20</w:t>
-            </w:r>
-          </w:p>
-        </w:tc>
-        <w:tc>
-          <w:tcPr>
-            <w:tcW w:type="dxa" w:w="3024"/>
-            <w:vAlign w:val="center"/>
-            <w:tcMar>
-              <w:top w:w="90" w:type="dxa"/>
-              <w:start w:w="110" w:type="dxa"/>
-              <w:bottom w:w="90" w:type="dxa"/>
-              <w:end w:w="110" w:type="dxa"/>
-            </w:tcMar>
-          </w:tcPr>
-          <w:p>
-            <w:pPr>
-              <w:jc w:val="left"/>
-            </w:pPr>
-            <w:r/>
-            <w:r>
-              <w:rPr>
-                <w:rFonts w:ascii="Times New Roman" w:hAnsi="Times New Roman" w:eastAsia="Times New Roman" w:cs="Times New Roman"/>
-                <w:b w:val="0"/>
-                <w:sz w:val="24"/>
-              </w:rPr>
-              <w:t>0.0685</w:t>
-            </w:r>
-          </w:p>
-        </w:tc>
-      </w:tr>
-      <w:tr>
-        <w:tc>
-          <w:tcPr>
-            <w:tcW w:type="dxa" w:w="3024"/>
-            <w:vAlign w:val="center"/>
-            <w:tcMar>
-              <w:top w:w="90" w:type="dxa"/>
-              <w:start w:w="110" w:type="dxa"/>
-              <w:bottom w:w="90" w:type="dxa"/>
-              <w:end w:w="110" w:type="dxa"/>
-            </w:tcMar>
-          </w:tcPr>
-          <w:p>
-            <w:pPr>
-              <w:jc w:val="center"/>
-            </w:pPr>
-            <w:r/>
-            <w:r>
-              <w:rPr>
-                <w:rFonts w:ascii="Times New Roman" w:hAnsi="Times New Roman" w:eastAsia="Times New Roman" w:cs="Times New Roman"/>
-                <w:b w:val="0"/>
-                <w:sz w:val="24"/>
-              </w:rPr>
-              <w:t>7</w:t>
-            </w:r>
-          </w:p>
-        </w:tc>
-        <w:tc>
-          <w:tcPr>
-            <w:tcW w:type="dxa" w:w="3024"/>
-            <w:vAlign w:val="center"/>
-            <w:tcMar>
-              <w:top w:w="90" w:type="dxa"/>
-              <w:start w:w="110" w:type="dxa"/>
-              <w:bottom w:w="90" w:type="dxa"/>
-              <w:end w:w="110" w:type="dxa"/>
-            </w:tcMar>
-          </w:tcPr>
-          <w:p>
-            <w:pPr>
-              <w:jc w:val="left"/>
-            </w:pPr>
-            <w:r/>
-            <w:r>
-              <w:rPr>
-                <w:rFonts w:ascii="Times New Roman" w:hAnsi="Times New Roman" w:eastAsia="Times New Roman" w:cs="Times New Roman"/>
-                <w:b w:val="0"/>
-                <w:sz w:val="24"/>
-              </w:rPr>
-              <w:t>sma20_vs_sma50</w:t>
-            </w:r>
-          </w:p>
-        </w:tc>
-        <w:tc>
-          <w:tcPr>
-            <w:tcW w:type="dxa" w:w="3024"/>
-            <w:vAlign w:val="center"/>
-            <w:tcMar>
-              <w:top w:w="90" w:type="dxa"/>
-              <w:start w:w="110" w:type="dxa"/>
-              <w:bottom w:w="90" w:type="dxa"/>
-              <w:end w:w="110" w:type="dxa"/>
-            </w:tcMar>
-          </w:tcPr>
-          <w:p>
-            <w:pPr>
-              <w:jc w:val="left"/>
-            </w:pPr>
-            <w:r/>
-            <w:r>
-              <w:rPr>
-                <w:rFonts w:ascii="Times New Roman" w:hAnsi="Times New Roman" w:eastAsia="Times New Roman" w:cs="Times New Roman"/>
-                <w:b w:val="0"/>
-                <w:sz w:val="24"/>
-              </w:rPr>
-              <w:t>0.0542</w:t>
-            </w:r>
-          </w:p>
-        </w:tc>
-      </w:tr>
-      <w:tr>
-        <w:tc>
-          <w:tcPr>
-            <w:tcW w:type="dxa" w:w="3024"/>
-            <w:vAlign w:val="center"/>
-            <w:tcMar>
-              <w:top w:w="90" w:type="dxa"/>
-              <w:start w:w="110" w:type="dxa"/>
-              <w:bottom w:w="90" w:type="dxa"/>
-              <w:end w:w="110" w:type="dxa"/>
-            </w:tcMar>
-          </w:tcPr>
-          <w:p>
-            <w:pPr>
-              <w:jc w:val="center"/>
-            </w:pPr>
-            <w:r/>
-            <w:r>
-              <w:rPr>
-                <w:rFonts w:ascii="Times New Roman" w:hAnsi="Times New Roman" w:eastAsia="Times New Roman" w:cs="Times New Roman"/>
-                <w:b w:val="0"/>
-                <w:sz w:val="24"/>
-              </w:rPr>
-              <w:t>8</w:t>
-            </w:r>
-          </w:p>
-        </w:tc>
-        <w:tc>
-          <w:tcPr>
-            <w:tcW w:type="dxa" w:w="3024"/>
-            <w:vAlign w:val="center"/>
-            <w:tcMar>
-              <w:top w:w="90" w:type="dxa"/>
-              <w:start w:w="110" w:type="dxa"/>
-              <w:bottom w:w="90" w:type="dxa"/>
-              <w:end w:w="110" w:type="dxa"/>
-            </w:tcMar>
-          </w:tcPr>
-          <w:p>
-            <w:pPr>
-              <w:jc w:val="left"/>
-            </w:pPr>
-            <w:r/>
-            <w:r>
-              <w:rPr>
-                <w:rFonts w:ascii="Times New Roman" w:hAnsi="Times New Roman" w:eastAsia="Times New Roman" w:cs="Times New Roman"/>
-                <w:b w:val="0"/>
-                <w:sz w:val="24"/>
-              </w:rPr>
-              <w:t>volume_change_1d</w:t>
-            </w:r>
-          </w:p>
-        </w:tc>
-        <w:tc>
-          <w:tcPr>
-            <w:tcW w:type="dxa" w:w="3024"/>
-            <w:vAlign w:val="center"/>
-            <w:tcMar>
-              <w:top w:w="90" w:type="dxa"/>
-              <w:start w:w="110" w:type="dxa"/>
-              <w:bottom w:w="90" w:type="dxa"/>
-              <w:end w:w="110" w:type="dxa"/>
-            </w:tcMar>
-          </w:tcPr>
-          <w:p>
-            <w:pPr>
-              <w:jc w:val="left"/>
-            </w:pPr>
-            <w:r/>
-            <w:r>
-              <w:rPr>
-                <w:rFonts w:ascii="Times New Roman" w:hAnsi="Times New Roman" w:eastAsia="Times New Roman" w:cs="Times New Roman"/>
-                <w:b w:val="0"/>
-                <w:sz w:val="24"/>
-              </w:rPr>
-              <w:t>0.0439</w:t>
             </w:r>
           </w:p>
         </w:tc>
@@ -7035,11 +7640,16 @@
       <w:pPr/>
     </w:p>
     <w:p>
+      <w:pPr>
+        <w:keepNext/>
+        <w:keepLines/>
+        <w:jc w:val="center"/>
+      </w:pPr>
       <w:r>
         <w:drawing>
           <wp:inline xmlns:a="http://schemas.openxmlformats.org/drawingml/2006/main" xmlns:pic="http://schemas.openxmlformats.org/drawingml/2006/picture">
-            <wp:extent cx="5303520" cy="3182112"/>
-            <wp:docPr id="5" name="Picture 5"/>
+            <wp:extent cx="4480560" cy="2675470"/>
+            <wp:docPr id="9" name="Picture 9" descr="Hình 8. Top đặc trưng quan trọng của Gradient Boosting" title="Hình 8. Top đặc trưng quan trọng của Gradient Boosting"/>
             <wp:cNvGraphicFramePr>
               <a:graphicFrameLocks noChangeAspect="1"/>
             </wp:cNvGraphicFramePr>
@@ -7051,7 +7661,7 @@
                     <pic:cNvPicPr/>
                   </pic:nvPicPr>
                   <pic:blipFill>
-                    <a:blip r:embed="rId14"/>
+                    <a:blip r:embed="rId18"/>
                     <a:stretch>
                       <a:fillRect/>
                     </a:stretch>
@@ -7059,7 +7669,7 @@
                   <pic:spPr>
                     <a:xfrm>
                       <a:off x="0" y="0"/>
-                      <a:ext cx="5303520" cy="3182112"/>
+                      <a:ext cx="4480560" cy="2675470"/>
                     </a:xfrm>
                     <a:prstGeom prst="rect"/>
                   </pic:spPr>
@@ -7072,6 +7682,8 @@
     </w:p>
     <w:p>
       <w:pPr>
+        <w:keepNext w:val="0"/>
+        <w:keepLines/>
         <w:jc w:val="center"/>
       </w:pPr>
       <w:r>
@@ -7080,7 +7692,7 @@
           <w:i/>
           <w:sz w:val="26"/>
         </w:rPr>
-        <w:t>Hình 4. Biểu đồ top đặc trưng quan trọng</w:t>
+        <w:t>Hình 8. Top đặc trưng quan trọng của Gradient Boosting</w:t>
       </w:r>
     </w:p>
     <w:p>
@@ -7089,17 +7701,13 @@
         <w:rPr>
           <w:rFonts w:ascii="Times New Roman" w:hAnsi="Times New Roman" w:eastAsia="Times New Roman" w:cs="Times New Roman"/>
         </w:rPr>
-        <w:t>volatility_20d là feature có importance cao nhất, cho thấy mức biến động trung hạn có đóng góp lớn trong quyết định của Random Forest. Các feature return_1d, volatility_5d, close_vs_sma20 và return_3d cũng nằm trong nhóm quan trọng. Tuy nhiên, feature importance chỉ phản ánh cách mô hình sử dụng dữ liệu, không chứng minh quan hệ nhân quả trên thị trường.</w:t>
-      </w:r>
-    </w:p>
-    <w:p>
-      <w:r>
-        <w:br w:type="page"/>
+        <w:t>Trong Gradient Boosting, volatility_20d có importance cao nhất 0.4236, tiếp theo là month 0.1796, return_20d 0.0763 và return_1d 0.0713. Các feature còn lại trong top 8 là volume_ratio_20, return_3d, volume_change_1d và close_open_return. Feature importance phản ánh cách model sử dụng dữ liệu, không chứng minh quan hệ nhân quả trên thị trường.</w:t>
       </w:r>
     </w:p>
     <w:p>
       <w:pPr>
         <w:pStyle w:val="Heading1"/>
+        <w:pageBreakBefore/>
       </w:pPr>
       <w:r>
         <w:rPr>
@@ -7114,7 +7722,7 @@
         <w:rPr>
           <w:rFonts w:ascii="Times New Roman" w:hAnsi="Times New Roman" w:eastAsia="Times New Roman" w:cs="Times New Roman"/>
         </w:rPr>
-        <w:t>Dự án đã đạt các mục tiêu chính: xây dựng pipeline dữ liệu HOSE, tạo bộ đặc trưng kỹ thuật, tạo nhãn UP/NOT_UP theo horizon 5 phiên và threshold 1%, huấn luyện/tuning nhiều mô hình, lựa chọn Random Forest làm final model, đồng thời triển khai artefact dự báo qua Flask/CLI và SQLite. Báo cáo kết quả hiện tại cho thấy Random Forest đạt F1_UP = 0.4391 và Recall_UP = 0.5142 trên tập kiểm thử, tốt hơn các mô hình còn lại khi xét mục tiêu phát hiện lớp UP.</w:t>
+        <w:t>Dự án đã xây dựng pipeline dữ liệu HOSE, tạo 20 đặc trưng kỹ thuật, tạo nhãn UP/NOT_UP theo horizon 5 phiên và threshold 1%, tuning ba model chính, đánh giá held-out TEST và triển khai Flask/CLI cùng SQLite. Gradient Boosting là Final Model với TEST F1_UP = 0.5053 và Recall_UP = 0.9176; kết quả chỉ nhỉnh hơn Random Forest, không cho thấy một model vượt trội tuyệt đối.</w:t>
       </w:r>
     </w:p>
     <w:p>
@@ -7123,7 +7731,7 @@
         <w:rPr>
           <w:rFonts w:ascii="Times New Roman" w:hAnsi="Times New Roman" w:eastAsia="Times New Roman" w:cs="Times New Roman"/>
         </w:rPr>
-        <w:t>Sản phẩm bàn giao chính gồm mã nguồn pipeline, dịch vụ dự báo, model final_model.pkl, model_metadata.json, reports đánh giá, confusion matrix, feature importance, database SQLite và giao diện web demo. Điểm mạnh của hệ thống là luồng xử lý rõ ràng, có kiểm soát leakage, có baseline, có tuning và có khả năng tái chạy. Hạn chế hiện tại là dữ liệu chỉ dựa trên OHLCV, chưa dùng tin tức, báo cáo tài chính, chỉ báo thị trường vĩ mô hoặc cơ chế backtesting giao dịch thực tế.</w:t>
+        <w:t>Sản phẩm bàn giao chính gồm mã nguồn pipeline, dịch vụ dự báo, model final_model.pkl, model_metadata.json, reports đánh giá, confusion matrix, feature importance, database SQLite và giao diện web demo. Điểm mạnh của hệ thống là luồng xử lý rõ ràng, có biện pháp giảm leakage, có baseline, có tuning và có khả năng tái chạy. Hạn chế hiện tại là dữ liệu chỉ dựa trên OHLCV, chưa dùng tin tức, báo cáo tài chính, chỉ báo thị trường vĩ mô hoặc cơ chế backtesting giao dịch thực tế.</w:t>
       </w:r>
     </w:p>
     <w:p>
@@ -7203,7 +7811,7 @@
         <w:rPr>
           <w:rFonts w:ascii="Times New Roman" w:hAnsi="Times New Roman" w:eastAsia="Times New Roman" w:cs="Times New Roman"/>
         </w:rPr>
-        <w:t>[5] scikit-learn developers, "RandomizedSearchCV and f1_score," scikit-learn documentation, 2026. [Online]. Available: https://scikit-learn.org/stable/modules/generated/sklearn.model_selection.RandomizedSearchCV.html</w:t>
+        <w:t>[5] scikit-learn developers, "f1_score," scikit-learn documentation, 2026. [Online]. Available: https://scikit-learn.org/stable/modules/generated/sklearn.metrics.f1_score.html</w:t>
       </w:r>
     </w:p>
     <w:p>

</xml_diff>

<commit_message>
docs(chatbot): sync all docs and report generator to action-decision architecture
Co-authored-by: Cursor <cursoragent@cursor.com>
</commit_message>
<xml_diff>
--- a/docs/bao_cao_project_hose_stock_prediction.docx
+++ b/docs/bao_cao_project_hose_stock_prediction.docx
@@ -1248,47 +1248,6 @@
               <w:pStyle w:val="TableText"/>
             </w:pPr>
             <w:r>
-              <w:t xml:space="preserve">SCI</w:t>
-            </w:r>
-          </w:p>
-        </w:tc>
-        <w:tc>
-          <w:tcPr>
-            <w:tcW w:w="3300" w:type="dxa"/>
-          </w:tcPr>
-          <w:p>
-            <w:pPr>
-              <w:pStyle w:val="TableText"/>
-            </w:pPr>
-            <w:r>
-              <w:t xml:space="preserve">Structured Context Injection</w:t>
-            </w:r>
-          </w:p>
-        </w:tc>
-        <w:tc>
-          <w:tcPr>
-            <w:tcW w:w="4470" w:type="dxa"/>
-          </w:tcPr>
-          <w:p>
-            <w:pPr>
-              <w:pStyle w:val="TableText"/>
-            </w:pPr>
-            <w:r>
-              <w:t xml:space="preserve">Server dựng context có cấu trúc rồi tiêm vào prompt</w:t>
-            </w:r>
-          </w:p>
-        </w:tc>
-      </w:tr>
-      <w:tr>
-        <w:tc>
-          <w:tcPr>
-            <w:tcW w:w="1300" w:type="dxa"/>
-          </w:tcPr>
-          <w:p>
-            <w:pPr>
-              <w:pStyle w:val="TableText"/>
-            </w:pPr>
-            <w:r>
               <w:t xml:space="preserve">SRS</w:t>
             </w:r>
           </w:p>
@@ -4707,7 +4666,7 @@
               <w:pStyle w:val="TableText"/>
             </w:pPr>
             <w:r>
-              <w:t xml:space="preserve">Định tuyến bằng luật, dựng context có cấu trúc từ dữ liệu nội bộ, gọi mô hình một lần</w:t>
+              <w:t xml:space="preserve">Gọi LLM một lần để chọn action, dispatcher cố định đọc dữ liệu nội bộ, formatter soạn câu trả lời</w:t>
             </w:r>
           </w:p>
         </w:tc>
@@ -5228,7 +5187,7 @@
               <w:pStyle w:val="TableText"/>
             </w:pPr>
             <w:r>
-              <w:t xml:space="preserve">Đặt câu hỏi bằng ngôn ngữ tự nhiên, hệ thống trả lời dựa trên dữ liệu nội bộ được nạp sẵn vào ngữ cảnh</w:t>
+              <w:t xml:space="preserve">Đặt câu hỏi bằng ngôn ngữ tự nhiên, LLM chọn action rồi hệ thống trả lời bằng số liệu đọc từ dữ liệu nội bộ</w:t>
             </w:r>
           </w:p>
         </w:tc>
@@ -6217,7 +6176,7 @@
               <w:pStyle w:val="TableText"/>
             </w:pPr>
             <w:r>
-              <w:t xml:space="preserve">Trang /chat và endpoint /api/chat định tuyến câu hỏi bằng luật, gọi handler dữ liệu nội bộ để dựng context rồi gọi mô hình ngôn ngữ đúng một lượt</w:t>
+              <w:t xml:space="preserve">Trang /chat và endpoint /api/chat gọi mô hình ngôn ngữ đúng một lượt để chọn action, validate quyết định rồi gọi handler dữ liệu nội bộ và format câu trả lời</w:t>
             </w:r>
           </w:p>
         </w:tc>
@@ -7316,7 +7275,7 @@
               <w:pStyle w:val="TableText"/>
             </w:pPr>
             <w:r>
-              <w:t xml:space="preserve">Dựng context server, gọi LLM một lần và kiểm grounding</w:t>
+              <w:t xml:space="preserve">Gọi LLM một lần chọn action, validate quyết định, dispatcher và formatter cố định</w:t>
             </w:r>
           </w:p>
         </w:tc>
@@ -9241,7 +9200,7 @@
     </w:p>
     <w:p>
       <w:r>
-        <w:t xml:space="preserve">Hàm predict_symbols nhận một đến hai mã, đọc dữ liệu đã làm sạch, sinh đặc trưng cho riêng các mã đó, lấy dòng mới nhất của từng mã rồi gọi mô hình. Thứ tự cột đầu vào được lấy từ feature_order trong metadata, không lấy theo thứ tự cột của DataFrame, nên không thể xảy ra lệch cột giữa lúc huấn luyện và lúc suy luận.</w:t>
+        <w:t xml:space="preserve">Hàm predict_symbols nhận một đến năm mã, đọc dữ liệu đã làm sạch, sinh đặc trưng cho riêng các mã đó, lấy dòng mới nhất của từng mã rồi gọi mô hình. Thứ tự cột đầu vào được lấy từ feature_order trong metadata, không lấy theo thứ tự cột của DataFrame, nên không thể xảy ra lệch cột giữa lúc huấn luyện và lúc suy luận.</w:t>
       </w:r>
     </w:p>
     <w:p>
@@ -9355,12 +9314,12 @@
     </w:p>
     <w:p>
       <w:r>
-        <w:t xml:space="preserve">Chatbot dùng kiến trúc structured context injection (SCI) với context do máy chủ dựng. Máy chủ định tuyến bằng luật (rule-based intent routing) để tự chọn và gọi trực tiếp các handler dữ liệu cần thiết, chỉ lấy artifact, report và tín hiệu đã công bố hoặc suy ra; không gửi raw CSV, mã nguồn hay pickle tới nhà cung cấp LLM.</w:t>
-      </w:r>
-    </w:p>
-    <w:p>
-      <w:r>
-        <w:t xml:space="preserve">Mọi lượt, kể cả chào hỏi, gọi mô hình đúng một lần mà không gửi tools hoặc tool_choice. Context tối đa 16.000 ký tự, thời hạn toàn lượt 60 giây, câu hỏi và câu trả lời tối đa 1.000 ký tự, lịch sử gửi kèm tối đa 6 tin nhắn. Máy chủ kiểm release, nguồn, cảnh báo và các cặp mã-trường-giá trị; cho nhận định xu hướng phù hợp dữ liệu nhưng chặn khuyến nghị mua bán trực tiếp. Dock và trang chat dùng chung sessionStorage.</w:t>
+        <w:t xml:space="preserve">Chatbot dùng kiến trúc action decision: mô hình ngôn ngữ lớn được gọi đúng một lần mỗi lượt và chỉ trả về một JSON thuần gồm hai khóa action và arguments, trong đó action là một trong năm giá trị cố định GENERAL_CHAT, STOCK_SIGNAL, STOCK_RANKING, PROJECT_INFO và OUT_OF_SCOPE. Máy chủ kiểm tra chặt schema của quyết định (đúng hai khóa, action hợp lệ, arguments đúng kiểu và miền giá trị) rồi mới gọi handler dữ liệu tương ứng qua một dispatcher cố định; không gửi raw CSV, mã nguồn hay pickle tới nhà cung cấp LLM.</w:t>
+      </w:r>
+    </w:p>
+    <w:p>
+      <w:r>
+        <w:t xml:space="preserve">Request không gửi tools, tool_choice hoặc response_format; không retry và không có lần gọi thứ hai. Câu hỏi tối đa 1.000 ký tự, lịch sử gửi kèm tối đa 6 tin nhắn, thời hạn toàn lượt 60 giây. Mọi câu chữ tới người dùng do máy chủ soạn: câu xã giao và câu từ chối là chuỗi cố định theo kind hoặc reason, câu trả lời dữ liệu do formatter ghép từ kết quả suy luận thật kèm khuyến cáo dữ liệu offline; yêu cầu khuyên mua bán được định tuyến sang OUT_OF_SCOPE và nhận câu từ chối cố định. Khung chat nổi và trang chat dùng chung sessionStorage.</w:t>
       </w:r>
     </w:p>
     <w:p>
@@ -9427,12 +9386,12 @@
         <w:fldChar w:fldCharType="end"/>
       </w:r>
       <w:r>
-        <w:t xml:space="preserve">. Lược đồ tuần tự một lượt hỏi đáp của chatbot theo kiến trúc SCI</w:t>
-      </w:r>
-    </w:p>
-    <w:p>
-      <w:r>
-        <w:t xml:space="preserve">Điểm đáng lưu ý trong lược đồ là thứ tự: máy chủ dựng xong context từ dữ liệu nội bộ rồi mới gọi nhà cung cấp LLM đúng một lần, và câu trả lời còn phải qua bước kiểm tính hợp lệ trước khi tới người dùng. Nhà cung cấp LLM không có đường nào chạm tới tệp CSV, mã nguồn hay tệp pickle của mô hình; phần duy nhất nó nhận được là đoạn context đã được cắt gọn dưới 16.000 ký tự.</w:t>
+        <w:t xml:space="preserve">. Lược đồ tuần tự một lượt hỏi đáp của chatbot theo kiến trúc action decision</w:t>
+      </w:r>
+    </w:p>
+    <w:p>
+      <w:r>
+        <w:t xml:space="preserve">Điểm đáng lưu ý trong lược đồ là ranh giới tin cậy: nhà cung cấp LLM chỉ nhận câu hỏi cùng lịch sử ngắn và chỉ trả về quyết định action; toàn bộ số liệu trong câu trả lời do máy chủ đọc từ artifact và report đã công bố, sau khi quyết định đã qua bước kiểm tính hợp lệ. Nhà cung cấp LLM không có đường nào chạm tới tệp CSV, mã nguồn hay tệp pickle của mô hình.</w:t>
       </w:r>
     </w:p>
     <w:p>
@@ -9662,7 +9621,7 @@
               <w:pStyle w:val="TableText"/>
             </w:pPr>
             <w:r>
-              <w:t xml:space="preserve">Luồng suy luận đầu cuối, route Flask, chatbot và tool</w:t>
+              <w:t xml:space="preserve">Luồng suy luận đầu cuối, route Flask, chatbot và handler dữ liệu</w:t>
             </w:r>
           </w:p>
         </w:tc>
@@ -9675,7 +9634,7 @@
               <w:pStyle w:val="TableText"/>
             </w:pPr>
             <w:r>
-              <w:t xml:space="preserve">test_prediction_flow.py, test_chatbot.py, test_chatbot_tools_upgrade.py</w:t>
+              <w:t xml:space="preserve">test_prediction_flow.py, test_chatbot.py</w:t>
             </w:r>
           </w:p>
         </w:tc>
@@ -9703,7 +9662,7 @@
               <w:pStyle w:val="TableText"/>
             </w:pPr>
             <w:r>
-              <w:t xml:space="preserve">Giao diện, điều hướng, khả năng truy cập, đối thoại tự nhiên</w:t>
+              <w:t xml:space="preserve">Giao diện, điều hướng, khả năng truy cập</w:t>
             </w:r>
           </w:p>
         </w:tc>
@@ -9716,7 +9675,7 @@
               <w:pStyle w:val="TableText"/>
             </w:pPr>
             <w:r>
-              <w:t xml:space="preserve">test_ui_shell.py, test_chatbot_ui_upgrade.py, test_chatbot_upgrade_integration.py</w:t>
+              <w:t xml:space="preserve">test_ui_shell.py</w:t>
             </w:r>
           </w:p>
         </w:tc>
@@ -9729,7 +9688,7 @@
     </w:p>
     <w:p>
       <w:r>
-        <w:t xml:space="preserve">Bộ kiểm thử hiện có 14 tệp với 183 hàm kiểm thử, chạy bằng lệnh python -m pytest tests/ hoặc python -m unittest discover -s tests. Toàn bộ kiểm thử chạy trên dữ liệu tổng hợp nhỏ được sinh ngay trong tệp kiểm thử, không phụ thuộc tệp CSV thật, nên thời gian chạy ngắn và kết quả không thay đổi theo dữ liệu.</w:t>
+        <w:t xml:space="preserve">Bộ kiểm thử hiện có 10 tệp với 153 ca kiểm thử (kèm 42 subtest), chạy bằng lệnh python -m pytest tests/ hoặc python -m unittest discover -s tests. Toàn bộ kiểm thử chạy trên dữ liệu tổng hợp nhỏ được sinh ngay trong tệp kiểm thử, không phụ thuộc tệp CSV thật, nên thời gian chạy ngắn và kết quả không thay đổi theo dữ liệu.</w:t>
       </w:r>
     </w:p>
     <w:p>
@@ -10422,7 +10381,7 @@
               <w:pStyle w:val="TableText"/>
             </w:pPr>
             <w:r>
-              <w:t xml:space="preserve">test_stock_signals_reject_duplicates_and_out_of_scope_before_inference</w:t>
+              <w:t xml:space="preserve">test_symbol_scope_is_all_or_nothing_before_inference</w:t>
             </w:r>
           </w:p>
         </w:tc>
@@ -10435,7 +10394,7 @@
               <w:pStyle w:val="TableText"/>
             </w:pPr>
             <w:r>
-              <w:t xml:space="preserve">Tool chatbot chặn mã trùng và mã ngoài phạm vi</w:t>
+              <w:t xml:space="preserve">Handler chatbot chặn mã ngoài phạm vi trước khi suy luận</w:t>
             </w:r>
           </w:p>
         </w:tc>
@@ -10448,7 +10407,7 @@
               <w:pStyle w:val="TableText"/>
             </w:pPr>
             <w:r>
-              <w:t xml:space="preserve">Trả lỗi có mã lỗi rõ ràng, không suy luận</w:t>
+              <w:t xml:space="preserve">Một mã ngoài phạm vi làm cả yêu cầu bị chặn, không suy luận</w:t>
             </w:r>
           </w:p>
         </w:tc>
@@ -13614,7 +13573,7 @@
           <w:rFonts w:ascii="Consolas" w:hAnsi="Consolas"/>
           <w:sz w:val="20"/>
         </w:rPr>
-        <w:t xml:space="preserve">python scripts/predict_stock.py --symbol SSI --log-db</w:t>
+        <w:t xml:space="preserve">python scripts/predict_stock.py --symbol SSI</w:t>
       </w:r>
     </w:p>
     <w:p>
@@ -13631,7 +13590,7 @@
     </w:p>
     <w:p>
       <w:r>
-        <w:t xml:space="preserve">Trang chủ nhận một đến hai mã và trả về nhãn UP hoặc NOT_UP kèm Điểm UP. Trang /evaluation trình bày ba khối kết quả tách biệt: kiểm định chéo trên TRAIN, chọn họ mô hình trên VALIDATION và đánh giá một lần trên TEST.</w:t>
+        <w:t xml:space="preserve">Trang chủ nhận một mã, trang /compare so sánh đúng hai mã; cả hai trả về nhãn UP hoặc NOT_UP kèm Điểm UP. Trang /evaluation trình bày ba khối kết quả tách biệt: kiểm định chéo trên TRAIN, chọn họ mô hình trên VALIDATION và đánh giá một lần trên TEST.</w:t>
       </w:r>
     </w:p>
     <w:p>

</xml_diff>

<commit_message>
chore(docs): remove AI-session leftovers and rebuild stale chatbot artifacts
Delete one-shot run_manual_* scripts, chat transcript dump, BAO_CAO_AI session report, placeholder logo, superseded pipeline.workflow.json draft, duplicate legacy tuning history and redundant .gitkeep files; drop slides/img copies that make_charts.py re-copies on every build. Rebuild report docx and flow figures, update slide deck (outline, script, build_pptx, chatbot_flow chart) from SCI wording to the Action-Decision two-call architecture (decision + grounded compose with formatter fallback), re-render chatbot-workflow.html and luuDo/01 runtime diagram, and refresh LEGACY_STALE markers plus GIAI_THICH_PROJECT.md to match.

Co-authored-by: Cursor <cursoragent@cursor.com>
</commit_message>
<xml_diff>
--- a/docs/bao_cao_project_hose_stock_prediction.docx
+++ b/docs/bao_cao_project_hose_stock_prediction.docx
@@ -10219,7 +10219,7 @@
               <w:pStyle w:val="TableText"/>
             </w:pPr>
             <w:r>
-              <w:t xml:space="preserve">Trang /chat và endpoint /api/chat gọi mô hình ngôn ngữ đúng một lượt để chọn action, validate quyết định rồi gọi handler dữ liệu nội bộ và format câu trả lời</w:t>
+              <w:t xml:space="preserve">Trang /chat và endpoint /api/chat gọi mô hình ngôn ngữ chọn action, validate quyết định, gọi handler dữ liệu nội bộ rồi để mô hình ngôn ngữ diễn đạt câu trả lời từ số liệu backend, có fallback formatter cố định</w:t>
             </w:r>
           </w:p>
         </w:tc>
@@ -13718,12 +13718,12 @@
     </w:p>
     <w:p>
       <w:r>
-        <w:t xml:space="preserve">Chatbot dùng kiến trúc action decision: mô hình ngôn ngữ lớn được gọi đúng một lần mỗi lượt và chỉ trả về một JSON thuần gồm hai khóa action và arguments, trong đó action là một trong năm giá trị cố định GENERAL_CHAT, STOCK_SIGNAL, STOCK_RANKING, PROJECT_INFO và OUT_OF_SCOPE. Máy chủ kiểm tra chặt schema của quyết định (đúng hai khóa, action hợp lệ, arguments đúng kiểu và miền giá trị) rồi mới gọi handler dữ liệu tương ứng qua một dispatcher cố định; không gửi raw CSV, mã nguồn hay pickle tới nhà cung cấp LLM.</w:t>
-      </w:r>
-    </w:p>
-    <w:p>
-      <w:r>
-        <w:t xml:space="preserve">Request không gửi tools, tool_choice hoặc response_format; không retry và không có lần gọi thứ hai. Câu hỏi tối đa 1.000 ký tự, lịch sử gửi kèm tối đa 6 tin nhắn, thời hạn toàn lượt 60 giây. Mọi câu chữ tới người dùng do máy chủ soạn: câu xã giao và câu từ chối là chuỗi cố định theo kind hoặc reason, câu trả lời dữ liệu do formatter ghép từ kết quả suy luận thật kèm khuyến cáo dữ liệu offline; yêu cầu khuyên mua bán được định tuyến sang OUT_OF_SCOPE và nhận câu từ chối cố định. Khung chat nổi và trang chat dùng chung sessionStorage.</w:t>
+        <w:t xml:space="preserve">Chatbot dùng kiến trúc action decision: mỗi lượt, mô hình ngôn ngữ lớn trước hết được gọi để định tuyến và chỉ trả về một JSON thuần gồm hai khóa action và arguments, trong đó action là một trong năm giá trị cố định GENERAL_CHAT, STOCK_SIGNAL, STOCK_RANKING, PROJECT_INFO và OUT_OF_SCOPE. Máy chủ kiểm tra chặt schema của quyết định (đúng hai khóa, action hợp lệ, arguments đúng kiểu và miền giá trị) rồi mới gọi handler dữ liệu tương ứng qua một dispatcher cố định; không gửi raw CSV, mã nguồn hay pickle tới nhà cung cấp LLM.</w:t>
+      </w:r>
+    </w:p>
+    <w:p>
+      <w:r>
+        <w:t xml:space="preserve">Request không gửi tools, tool_choice hoặc response_format; không retry, không tool loop. Câu hỏi tối đa 1.000 ký tự, lịch sử gửi kèm tối đa 6 tin nhắn, thời hạn toàn lượt 60 giây bao trùm cả hai lần gọi. Câu xã giao và câu từ chối là chuỗi cố định theo kind hoặc reason do máy chủ soạn; câu trả lời dữ liệu do formatter ghép từ kết quả suy luận thật, sau đó mô hình ngôn ngữ được gọi lần thứ hai để diễn đạt tự nhiên từ đúng số liệu đó (thất bại thì giữ nguyên bản formatter), khuyến cáo dữ liệu offline luôn do máy chủ gắn; yêu cầu khuyên mua bán được định tuyến sang OUT_OF_SCOPE và nhận câu từ chối cố định. Khung chat nổi và trang chat dùng chung sessionStorage.</w:t>
       </w:r>
     </w:p>
     <w:p>

</xml_diff>